<commit_message>
fixed task1with adding a method to get the len of replay_buffer
</commit_message>
<xml_diff>
--- a/Code Exam/实验8 强化学习与游戏-20250328.docx
+++ b/Code Exam/实验8 强化学习与游戏-20250328.docx
@@ -5,9 +5,6 @@
     <w:p>
       <w:pPr>
         <w:pStyle w:val="-1"/>
-        <w:rPr>
-          <w:rFonts w:hint="eastAsia"/>
-        </w:rPr>
       </w:pPr>
       <w:r>
         <w:rPr>
@@ -31,9 +28,6 @@
     <w:p>
       <w:pPr>
         <w:pStyle w:val="-2"/>
-        <w:rPr>
-          <w:rFonts w:hint="eastAsia"/>
-        </w:rPr>
       </w:pPr>
       <w:r>
         <w:rPr>
@@ -52,9 +46,6 @@
       <w:pPr>
         <w:pStyle w:val="-5"/>
         <w:spacing w:afterLines="50" w:after="156"/>
-        <w:rPr>
-          <w:rFonts w:hint="eastAsia"/>
-        </w:rPr>
       </w:pPr>
       <w:r>
         <w:rPr>
@@ -84,7 +75,20 @@
         <w:rPr>
           <w:rFonts w:hint="eastAsia"/>
         </w:rPr>
-        <w:t>）的一个重要分支，其本质是解决决策制定（</w:t>
+        <w:t>）的一个重要分支，其本质是解决</w:t>
+      </w:r>
+      <w:r>
+        <w:rPr>
+          <w:rFonts w:hint="eastAsia"/>
+          <w:color w:val="EE0000"/>
+        </w:rPr>
+        <w:t>决策制定</w:t>
+      </w:r>
+      <w:r>
+        <w:rPr>
+          <w:rFonts w:hint="eastAsia"/>
+        </w:rPr>
+        <w:t>（</w:t>
       </w:r>
       <w:r>
         <w:rPr>
@@ -263,9 +267,6 @@
         <w:pStyle w:val="-5"/>
         <w:ind w:firstLineChars="0" w:firstLine="0"/>
         <w:jc w:val="center"/>
-        <w:rPr>
-          <w:rFonts w:hint="eastAsia"/>
-        </w:rPr>
       </w:pPr>
       <w:r>
         <w:rPr>
@@ -330,9 +331,6 @@
     <w:p>
       <w:pPr>
         <w:pStyle w:val="-7"/>
-        <w:rPr>
-          <w:rFonts w:hint="eastAsia"/>
-        </w:rPr>
       </w:pPr>
       <w:r>
         <w:rPr>
@@ -358,17 +356,11 @@
         <w:pStyle w:val="-7"/>
         <w:ind w:firstLineChars="0" w:firstLine="0"/>
         <w:jc w:val="both"/>
-        <w:rPr>
-          <w:rFonts w:hint="eastAsia"/>
-        </w:rPr>
       </w:pPr>
     </w:p>
     <w:p>
       <w:pPr>
         <w:pStyle w:val="-2"/>
-        <w:rPr>
-          <w:rFonts w:hint="eastAsia"/>
-        </w:rPr>
       </w:pPr>
       <w:r>
         <w:rPr>
@@ -392,9 +384,6 @@
           <w:numId w:val="1"/>
         </w:numPr>
         <w:ind w:firstLineChars="0"/>
-        <w:rPr>
-          <w:rFonts w:hint="eastAsia"/>
-        </w:rPr>
       </w:pPr>
       <w:r>
         <w:rPr>
@@ -423,9 +412,6 @@
           <w:numId w:val="1"/>
         </w:numPr>
         <w:ind w:firstLineChars="0"/>
-        <w:rPr>
-          <w:rFonts w:hint="eastAsia"/>
-        </w:rPr>
       </w:pPr>
       <w:r>
         <w:rPr>
@@ -454,9 +440,6 @@
           <w:numId w:val="1"/>
         </w:numPr>
         <w:ind w:firstLineChars="0"/>
-        <w:rPr>
-          <w:rFonts w:hint="eastAsia"/>
-        </w:rPr>
       </w:pPr>
       <w:r>
         <w:rPr>
@@ -497,9 +480,6 @@
           <w:numId w:val="1"/>
         </w:numPr>
         <w:ind w:firstLineChars="0"/>
-        <w:rPr>
-          <w:rFonts w:hint="eastAsia"/>
-        </w:rPr>
       </w:pPr>
       <w:r>
         <w:rPr>
@@ -511,9 +491,6 @@
     <w:p>
       <w:pPr>
         <w:pStyle w:val="-2"/>
-        <w:rPr>
-          <w:rFonts w:hint="eastAsia"/>
-        </w:rPr>
       </w:pPr>
       <w:r>
         <w:rPr>
@@ -531,9 +508,6 @@
     <w:p>
       <w:pPr>
         <w:pStyle w:val="-3"/>
-        <w:rPr>
-          <w:rFonts w:hint="eastAsia"/>
-        </w:rPr>
       </w:pPr>
       <w:r>
         <w:rPr>
@@ -551,9 +525,6 @@
     <w:p>
       <w:pPr>
         <w:pStyle w:val="-5"/>
-        <w:rPr>
-          <w:rFonts w:hint="eastAsia"/>
-        </w:rPr>
       </w:pPr>
       <w:r>
         <w:rPr>
@@ -615,9 +586,6 @@
     <w:p>
       <w:pPr>
         <w:pStyle w:val="-4"/>
-        <w:rPr>
-          <w:rFonts w:hint="eastAsia"/>
-        </w:rPr>
       </w:pPr>
       <w:r>
         <w:t>强化学习与其他学习方式的关系</w:t>
@@ -632,7 +600,6 @@
         </w:numPr>
         <w:ind w:firstLineChars="0"/>
         <w:rPr>
-          <w:rFonts w:hint="eastAsia"/>
           <w:b/>
           <w:bCs/>
         </w:rPr>
@@ -648,9 +615,6 @@
     <w:p>
       <w:pPr>
         <w:pStyle w:val="-5"/>
-        <w:rPr>
-          <w:rFonts w:hint="eastAsia"/>
-        </w:rPr>
       </w:pPr>
       <w:r>
         <w:t>机器学习是人工智能的一个核心领域，主要研究如何通过数据和算法使计算机能够自主地学习和改进。机器学习可以根据学习方式的不同，分为监督学习、无监督学习、强化学习</w:t>
@@ -686,9 +650,6 @@
     <w:p>
       <w:pPr>
         <w:pStyle w:val="-5"/>
-        <w:rPr>
-          <w:rFonts w:hint="eastAsia"/>
-        </w:rPr>
       </w:pPr>
       <w:r>
         <w:t>机器学习的共同目标是让计算机从数据中学习并做出决策，但它们的学习过程和数据使用方式有所不同。</w:t>
@@ -699,9 +660,6 @@
         <w:pStyle w:val="-5"/>
         <w:ind w:firstLineChars="0" w:firstLine="0"/>
         <w:jc w:val="center"/>
-        <w:rPr>
-          <w:rFonts w:hint="eastAsia"/>
-        </w:rPr>
       </w:pPr>
       <w:r>
         <w:rPr>
@@ -753,9 +711,6 @@
     <w:p>
       <w:pPr>
         <w:pStyle w:val="-7"/>
-        <w:rPr>
-          <w:rFonts w:hint="eastAsia"/>
-        </w:rPr>
       </w:pPr>
       <w:r>
         <w:rPr>
@@ -785,7 +740,6 @@
         </w:numPr>
         <w:ind w:firstLineChars="0"/>
         <w:rPr>
-          <w:rFonts w:hint="eastAsia"/>
           <w:b/>
           <w:bCs/>
         </w:rPr>
@@ -802,9 +756,6 @@
     <w:p>
       <w:pPr>
         <w:pStyle w:val="-5"/>
-        <w:rPr>
-          <w:rFonts w:hint="eastAsia"/>
-        </w:rPr>
       </w:pPr>
       <w:r>
         <w:t>在监督学习中，模型通过大量的标注数据进行训练。每个输入数据都有对应的</w:t>
@@ -833,9 +784,6 @@
     <w:p>
       <w:pPr>
         <w:pStyle w:val="-5"/>
-        <w:rPr>
-          <w:rFonts w:hint="eastAsia"/>
-        </w:rPr>
       </w:pPr>
       <w:r>
         <w:t>在监督学习中，输入数据和输出标签是已知的，而强化学习的环境状态和奖励是由环境根据智能体的动作动态生成的。</w:t>
@@ -850,7 +798,6 @@
         </w:numPr>
         <w:ind w:firstLineChars="0"/>
         <w:rPr>
-          <w:rFonts w:hint="eastAsia"/>
           <w:b/>
           <w:bCs/>
         </w:rPr>
@@ -866,9 +813,6 @@
     <w:p>
       <w:pPr>
         <w:pStyle w:val="-5"/>
-        <w:rPr>
-          <w:rFonts w:hint="eastAsia"/>
-        </w:rPr>
       </w:pPr>
       <w:r>
         <w:t>无监督学习不依赖于标签数据，目标是从数据中发现潜在的结构或模式。常见的方法包括聚类（如</w:t>
@@ -889,9 +833,6 @@
     <w:p>
       <w:pPr>
         <w:pStyle w:val="-5"/>
-        <w:rPr>
-          <w:rFonts w:hint="eastAsia"/>
-        </w:rPr>
       </w:pPr>
       <w:r>
         <w:t>无监督学习主要关注在没有监督信号的情况下识别数据中的结构模式，而强化学习侧重于智能体与环境的互动，目标是通过奖励信号引导学习。</w:t>
@@ -905,9 +846,6 @@
           <w:numId w:val="2"/>
         </w:numPr>
         <w:ind w:firstLineChars="0"/>
-        <w:rPr>
-          <w:rFonts w:hint="eastAsia"/>
-        </w:rPr>
       </w:pPr>
       <w:r>
         <w:rPr>
@@ -920,9 +858,6 @@
     <w:p>
       <w:pPr>
         <w:pStyle w:val="-5"/>
-        <w:rPr>
-          <w:rFonts w:hint="eastAsia"/>
-        </w:rPr>
       </w:pPr>
       <w:r>
         <w:t>深度学习是机器学习的</w:t>
@@ -939,9 +874,6 @@
     <w:p>
       <w:pPr>
         <w:pStyle w:val="-5"/>
-        <w:rPr>
-          <w:rFonts w:hint="eastAsia"/>
-        </w:rPr>
       </w:pPr>
       <w:r>
         <w:t>强化学习和深度学习在某些情况下是可以结合的，即深度强化学习（</w:t>
@@ -962,9 +894,6 @@
     <w:p>
       <w:pPr>
         <w:pStyle w:val="-4"/>
-        <w:rPr>
-          <w:rFonts w:hint="eastAsia"/>
-        </w:rPr>
       </w:pPr>
       <w:r>
         <w:t>强化学习的核心概念</w:t>
@@ -973,9 +902,6 @@
     <w:p>
       <w:pPr>
         <w:pStyle w:val="-5"/>
-        <w:rPr>
-          <w:rFonts w:hint="eastAsia"/>
-        </w:rPr>
       </w:pPr>
       <w:r>
         <w:t>在强化学习的框架中，核心概念涉及多个关键元素，它们共同决定了智能体如何在环境中做出决策，并最终实现最大化长期回报的目标。下面是强化学习的主要核心概念的扩展和详细解释：</w:t>
@@ -987,7 +913,6 @@
         <w:ind w:firstLine="422"/>
         <w:rPr>
           <w:rStyle w:val="a9"/>
-          <w:rFonts w:hint="eastAsia"/>
         </w:rPr>
       </w:pPr>
       <w:r>
@@ -1018,9 +943,6 @@
     <w:p>
       <w:pPr>
         <w:pStyle w:val="-5"/>
-        <w:rPr>
-          <w:rFonts w:hint="eastAsia"/>
-        </w:rPr>
       </w:pPr>
       <w:r>
         <w:t>定义：环境是智能体与之交互的外部世界，它定义了智能体可以执行的所有操作，并对智能体的动作做出反馈。环境的状态随着智能体的动作不断变化，智能体通过观察环境状态，选择动作，并根据环境返回的反馈（奖励和新的状态）来调整其策略。</w:t>
@@ -1029,9 +951,6 @@
     <w:p>
       <w:pPr>
         <w:pStyle w:val="-5"/>
-        <w:rPr>
-          <w:rFonts w:hint="eastAsia"/>
-        </w:rPr>
       </w:pPr>
       <w:r>
         <w:t>作用：环境是强化学习的核心组成部分，它向智能</w:t>
@@ -1060,9 +979,6 @@
     <w:p>
       <w:pPr>
         <w:pStyle w:val="-5"/>
-        <w:rPr>
-          <w:rFonts w:hint="eastAsia"/>
-        </w:rPr>
       </w:pPr>
       <w:r>
         <w:t>实例：在自动驾驶中，环境就是路况、交通信号、其他车辆的位置等；智能体则是自动驾驶汽车，通过感知环境并做出决策（如加速、刹车、转弯等）。</w:t>
@@ -1073,7 +989,6 @@
         <w:pStyle w:val="-5"/>
         <w:ind w:firstLine="422"/>
         <w:rPr>
-          <w:rFonts w:hint="eastAsia"/>
           <w:b/>
           <w:bCs/>
         </w:rPr>
@@ -1096,9 +1011,6 @@
     <w:p>
       <w:pPr>
         <w:pStyle w:val="-5"/>
-        <w:rPr>
-          <w:rFonts w:hint="eastAsia"/>
-        </w:rPr>
       </w:pPr>
       <w:r>
         <w:t>定义：智能体是一个执行决策的主体。它通过与环境的交互，观察环境的状态并根据策略选择行动。智能体的目标是通过这些行动，最大化其在环境中获得的累积奖励。</w:t>
@@ -1107,9 +1019,6 @@
     <w:p>
       <w:pPr>
         <w:pStyle w:val="-5"/>
-        <w:rPr>
-          <w:rFonts w:hint="eastAsia"/>
-        </w:rPr>
       </w:pPr>
       <w:r>
         <w:t>作用：智能</w:t>
@@ -1126,9 +1035,6 @@
     <w:p>
       <w:pPr>
         <w:pStyle w:val="-5"/>
-        <w:rPr>
-          <w:rFonts w:hint="eastAsia"/>
-        </w:rPr>
       </w:pPr>
       <w:r>
         <w:lastRenderedPageBreak/>
@@ -1140,7 +1046,6 @@
         <w:pStyle w:val="-5"/>
         <w:ind w:firstLine="422"/>
         <w:rPr>
-          <w:rFonts w:hint="eastAsia"/>
           <w:b/>
           <w:bCs/>
         </w:rPr>
@@ -1177,9 +1082,6 @@
     <w:p>
       <w:pPr>
         <w:pStyle w:val="-5"/>
-        <w:rPr>
-          <w:rFonts w:hint="eastAsia"/>
-        </w:rPr>
       </w:pPr>
       <w:r>
         <w:t>定义：状态空间描述了环境在任何给定时刻的所有可能状态。每个状态反映了环境的某个特定配置，它包含了所有能够影响智能</w:t>
@@ -1196,9 +1098,6 @@
     <w:p>
       <w:pPr>
         <w:pStyle w:val="-5"/>
-        <w:rPr>
-          <w:rFonts w:hint="eastAsia"/>
-        </w:rPr>
       </w:pPr>
       <w:r>
         <w:t>作用：状态空间为智能</w:t>
@@ -1215,9 +1114,6 @@
     <w:p>
       <w:pPr>
         <w:pStyle w:val="-5"/>
-        <w:rPr>
-          <w:rFonts w:hint="eastAsia"/>
-        </w:rPr>
       </w:pPr>
       <w:r>
         <w:t>实例：在棋盘游戏中，每个棋盘配置可以作为一个状态。状态空间的大小是有限的</w:t>
@@ -1237,7 +1133,6 @@
         <w:pStyle w:val="-5"/>
         <w:ind w:firstLine="422"/>
         <w:rPr>
-          <w:rFonts w:hint="eastAsia"/>
           <w:b/>
           <w:bCs/>
         </w:rPr>
@@ -1274,9 +1169,6 @@
     <w:p>
       <w:pPr>
         <w:pStyle w:val="-5"/>
-        <w:rPr>
-          <w:rFonts w:hint="eastAsia"/>
-        </w:rPr>
       </w:pPr>
       <w:r>
         <w:t>定义：动作空间是智能体可以采取的所有可能动作的集合。智能体根据当前的状态选择一个动作来与环境交互，从而影响状态的变化。动作空间可以是离散的，也可以是连续的。</w:t>
@@ -1285,9 +1177,6 @@
     <w:p>
       <w:pPr>
         <w:pStyle w:val="-5"/>
-        <w:rPr>
-          <w:rFonts w:hint="eastAsia"/>
-        </w:rPr>
       </w:pPr>
       <w:r>
         <w:t>作用：智能体的每个动作会导致环境状态的变化，并可能产生相应的奖励。因此，动作空间是智能体决策过程中的关键要素。</w:t>
@@ -1296,9 +1185,6 @@
     <w:p>
       <w:pPr>
         <w:pStyle w:val="-5"/>
-        <w:rPr>
-          <w:rFonts w:hint="eastAsia"/>
-        </w:rPr>
       </w:pPr>
       <w:r>
         <w:t>实例：在棋盘游戏中，动作可以是</w:t>
@@ -1366,7 +1252,6 @@
         <w:pStyle w:val="-5"/>
         <w:ind w:firstLine="422"/>
         <w:rPr>
-          <w:rFonts w:hint="eastAsia"/>
           <w:b/>
           <w:bCs/>
         </w:rPr>
@@ -1403,9 +1288,6 @@
     <w:p>
       <w:pPr>
         <w:pStyle w:val="-5"/>
-        <w:rPr>
-          <w:rFonts w:hint="eastAsia"/>
-        </w:rPr>
       </w:pPr>
       <w:r>
         <w:t>定义：奖励函数定义了智能体在执行某个动作后获得的即时反馈（奖励或惩罚）。奖励是一个标量值，智能体通过奖励来评估其行为的好坏。</w:t>
@@ -1414,9 +1296,6 @@
     <w:p>
       <w:pPr>
         <w:pStyle w:val="-5"/>
-        <w:rPr>
-          <w:rFonts w:hint="eastAsia"/>
-        </w:rPr>
       </w:pPr>
       <w:r>
         <w:t>作用：奖励函数是智能</w:t>
@@ -1433,9 +1312,6 @@
     <w:p>
       <w:pPr>
         <w:pStyle w:val="-5"/>
-        <w:rPr>
-          <w:rFonts w:hint="eastAsia"/>
-        </w:rPr>
       </w:pPr>
       <w:r>
         <w:t>实例：在游戏中，智能体可能会根据得分、时间限制等因素获得奖励或惩罚</w:t>
@@ -1479,7 +1355,6 @@
         <w:pStyle w:val="-5"/>
         <w:ind w:firstLine="422"/>
         <w:rPr>
-          <w:rFonts w:hint="eastAsia"/>
           <w:b/>
           <w:bCs/>
         </w:rPr>
@@ -1516,9 +1391,6 @@
     <w:p>
       <w:pPr>
         <w:pStyle w:val="-5"/>
-        <w:rPr>
-          <w:rFonts w:hint="eastAsia"/>
-        </w:rPr>
       </w:pPr>
       <w:r>
         <w:t>定义：策略是智能体在给定状态下选择行动的规则或模型。策略可以是确定性的（即在某一状态下总是采取相同的动作），也可以是随机的（即在某一状态下可能采取不同的动作）。</w:t>
@@ -1527,9 +1399,6 @@
     <w:p>
       <w:pPr>
         <w:pStyle w:val="-5"/>
-        <w:rPr>
-          <w:rFonts w:hint="eastAsia"/>
-        </w:rPr>
       </w:pPr>
       <w:r>
         <w:t>作用：策略决定了智能体的行为，它是强化学习的核心部分。通过优化策略，智能体可以提高获得奖励的机会。</w:t>
@@ -1538,9 +1407,6 @@
     <w:p>
       <w:pPr>
         <w:pStyle w:val="-5"/>
-        <w:rPr>
-          <w:rFonts w:hint="eastAsia"/>
-        </w:rPr>
       </w:pPr>
       <w:r>
         <w:t>实例：在棋盘游戏中，智能体可能在某个状态下总是选择向上移动。</w:t>
@@ -1551,7 +1417,6 @@
         <w:pStyle w:val="-5"/>
         <w:ind w:firstLine="422"/>
         <w:rPr>
-          <w:rFonts w:hint="eastAsia"/>
           <w:b/>
           <w:bCs/>
         </w:rPr>
@@ -1588,9 +1453,6 @@
     <w:p>
       <w:pPr>
         <w:pStyle w:val="-5"/>
-        <w:rPr>
-          <w:rFonts w:hint="eastAsia"/>
-        </w:rPr>
       </w:pPr>
       <w:r>
         <w:t>定义：价值函数评估一个状态或状态</w:t>
@@ -1605,9 +1467,6 @@
     <w:p>
       <w:pPr>
         <w:pStyle w:val="-5"/>
-        <w:rPr>
-          <w:rFonts w:hint="eastAsia"/>
-        </w:rPr>
       </w:pPr>
       <w:r>
         <w:t>作用：通过价值函数，智能体可以评估某个状态的好坏，从而决定是否要采取某个行动。</w:t>
@@ -1616,9 +1475,6 @@
     <w:p>
       <w:pPr>
         <w:pStyle w:val="-5"/>
-        <w:rPr>
-          <w:rFonts w:hint="eastAsia"/>
-        </w:rPr>
       </w:pPr>
       <w:r>
         <w:t>实例：在迷宫游戏中，状态的价值表示从该位置出发，最终到达目标的可能回报。</w:t>
@@ -1629,7 +1485,6 @@
         <w:pStyle w:val="-5"/>
         <w:ind w:firstLine="422"/>
         <w:rPr>
-          <w:rFonts w:hint="eastAsia"/>
           <w:b/>
           <w:bCs/>
         </w:rPr>
@@ -1667,9 +1522,6 @@
     <w:p>
       <w:pPr>
         <w:pStyle w:val="-5"/>
-        <w:rPr>
-          <w:rFonts w:hint="eastAsia"/>
-        </w:rPr>
       </w:pPr>
       <w:r>
         <w:t>定义：</w:t>
@@ -1704,9 +1556,6 @@
     <w:p>
       <w:pPr>
         <w:pStyle w:val="-5"/>
-        <w:rPr>
-          <w:rFonts w:hint="eastAsia"/>
-        </w:rPr>
       </w:pPr>
       <w:r>
         <w:t>作用：</w:t>
@@ -1729,9 +1578,6 @@
     <w:p>
       <w:pPr>
         <w:pStyle w:val="-5"/>
-        <w:rPr>
-          <w:rFonts w:hint="eastAsia"/>
-        </w:rPr>
       </w:pPr>
       <w:r>
         <w:t>实例：在</w:t>
@@ -1758,9 +1604,6 @@
     <w:p>
       <w:pPr>
         <w:pStyle w:val="-4"/>
-        <w:rPr>
-          <w:rFonts w:hint="eastAsia"/>
-        </w:rPr>
       </w:pPr>
       <w:r>
         <w:t>强化学习的流程</w:t>
@@ -1769,9 +1612,6 @@
     <w:p>
       <w:pPr>
         <w:pStyle w:val="-5"/>
-        <w:rPr>
-          <w:rFonts w:hint="eastAsia"/>
-        </w:rPr>
       </w:pPr>
       <w:r>
         <w:t>强化学习的流程可以通过马尔可夫决策过程（</w:t>
@@ -1842,9 +1682,6 @@
           <w:numId w:val="3"/>
         </w:numPr>
         <w:ind w:firstLineChars="0"/>
-        <w:rPr>
-          <w:rFonts w:hint="eastAsia"/>
-        </w:rPr>
       </w:pPr>
       <w:r>
         <w:rPr>
@@ -1871,9 +1708,6 @@
           <w:numId w:val="3"/>
         </w:numPr>
         <w:ind w:firstLineChars="0"/>
-        <w:rPr>
-          <w:rFonts w:hint="eastAsia"/>
-        </w:rPr>
       </w:pPr>
       <w:r>
         <w:rPr>
@@ -1894,9 +1728,6 @@
           <w:numId w:val="3"/>
         </w:numPr>
         <w:ind w:firstLineChars="0"/>
-        <w:rPr>
-          <w:rFonts w:hint="eastAsia"/>
-        </w:rPr>
       </w:pPr>
       <w:r>
         <w:rPr>
@@ -1920,9 +1751,6 @@
           <w:tab w:val="clear" w:pos="420"/>
         </w:tabs>
         <w:ind w:firstLineChars="0"/>
-        <w:rPr>
-          <w:rFonts w:hint="eastAsia"/>
-        </w:rPr>
       </w:pPr>
       <w:r>
         <w:rPr>
@@ -1943,9 +1771,6 @@
           <w:numId w:val="3"/>
         </w:numPr>
         <w:ind w:firstLineChars="0"/>
-        <w:rPr>
-          <w:rFonts w:hint="eastAsia"/>
-        </w:rPr>
       </w:pPr>
       <w:r>
         <w:rPr>
@@ -1963,9 +1788,6 @@
         <w:pStyle w:val="-5"/>
         <w:ind w:firstLineChars="0" w:firstLine="0"/>
         <w:jc w:val="center"/>
-        <w:rPr>
-          <w:rFonts w:hint="eastAsia"/>
-        </w:rPr>
       </w:pPr>
       <w:r>
         <w:rPr>
@@ -2017,9 +1839,6 @@
     <w:p>
       <w:pPr>
         <w:pStyle w:val="-7"/>
-        <w:rPr>
-          <w:rFonts w:hint="eastAsia"/>
-        </w:rPr>
       </w:pPr>
       <w:r>
         <w:rPr>
@@ -2043,9 +1862,6 @@
     <w:p>
       <w:pPr>
         <w:pStyle w:val="-4"/>
-        <w:rPr>
-          <w:rFonts w:hint="eastAsia"/>
-        </w:rPr>
       </w:pPr>
       <w:r>
         <w:t>强化学习算法的分类</w:t>
@@ -2054,9 +1870,6 @@
     <w:p>
       <w:pPr>
         <w:pStyle w:val="-5"/>
-        <w:rPr>
-          <w:rFonts w:hint="eastAsia"/>
-        </w:rPr>
       </w:pPr>
       <w:r>
         <w:t>根据强化学习的学习目标和方法，强化学习算法可以进一步分为基于值的算法、基于策略的算法和</w:t>
@@ -2081,9 +1894,6 @@
           <w:ilvl w:val="0"/>
           <w:numId w:val="4"/>
         </w:numPr>
-        <w:rPr>
-          <w:rFonts w:hint="eastAsia"/>
-        </w:rPr>
       </w:pPr>
       <w:r>
         <w:rPr>
@@ -2095,9 +1905,6 @@
     <w:p>
       <w:pPr>
         <w:pStyle w:val="-5"/>
-        <w:rPr>
-          <w:rFonts w:hint="eastAsia"/>
-        </w:rPr>
       </w:pPr>
       <w:r>
         <w:t>基于值的强化学习算法是强化学习的一个重要类别，主要通过评估状态或状态</w:t>
@@ -2118,9 +1925,6 @@
     <w:p>
       <w:pPr>
         <w:pStyle w:val="-5"/>
-        <w:rPr>
-          <w:rFonts w:hint="eastAsia"/>
-        </w:rPr>
       </w:pPr>
       <w:r>
         <w:lastRenderedPageBreak/>
@@ -2156,9 +1960,6 @@
     <w:p>
       <w:pPr>
         <w:pStyle w:val="-9"/>
-        <w:rPr>
-          <w:rFonts w:hint="eastAsia"/>
-        </w:rPr>
       </w:pPr>
       <w:r>
         <w:rPr>
@@ -2186,7 +1987,7 @@
             <w:pPr>
               <w:jc w:val="center"/>
               <w:rPr>
-                <w:rFonts w:eastAsia="宋体" w:hint="eastAsia"/>
+                <w:rFonts w:eastAsia="宋体"/>
                 <w:sz w:val="18"/>
                 <w:szCs w:val="18"/>
               </w:rPr>
@@ -2209,7 +2010,7 @@
             <w:pPr>
               <w:jc w:val="center"/>
               <w:rPr>
-                <w:rFonts w:eastAsia="宋体" w:hint="eastAsia"/>
+                <w:rFonts w:eastAsia="宋体"/>
                 <w:sz w:val="18"/>
                 <w:szCs w:val="18"/>
               </w:rPr>
@@ -2235,7 +2036,7 @@
             <w:pPr>
               <w:jc w:val="center"/>
               <w:rPr>
-                <w:rFonts w:eastAsia="宋体" w:hint="eastAsia"/>
+                <w:rFonts w:eastAsia="宋体"/>
                 <w:sz w:val="18"/>
                 <w:szCs w:val="18"/>
               </w:rPr>
@@ -2257,7 +2058,7 @@
           <w:p>
             <w:pPr>
               <w:rPr>
-                <w:rFonts w:eastAsia="宋体" w:hint="eastAsia"/>
+                <w:rFonts w:eastAsia="宋体"/>
                 <w:sz w:val="18"/>
                 <w:szCs w:val="18"/>
               </w:rPr>
@@ -2387,7 +2188,7 @@
             <w:pPr>
               <w:jc w:val="center"/>
               <w:rPr>
-                <w:rFonts w:eastAsia="宋体" w:hint="eastAsia"/>
+                <w:rFonts w:eastAsia="宋体"/>
                 <w:sz w:val="18"/>
                 <w:szCs w:val="18"/>
               </w:rPr>
@@ -2501,7 +2302,7 @@
             <w:pPr>
               <w:jc w:val="center"/>
               <w:rPr>
-                <w:rFonts w:eastAsia="宋体" w:hint="eastAsia"/>
+                <w:rFonts w:eastAsia="宋体"/>
                 <w:sz w:val="18"/>
                 <w:szCs w:val="18"/>
               </w:rPr>
@@ -2523,7 +2324,7 @@
           <w:p>
             <w:pPr>
               <w:rPr>
-                <w:rFonts w:eastAsia="宋体" w:hint="eastAsia"/>
+                <w:rFonts w:eastAsia="宋体"/>
                 <w:sz w:val="18"/>
                 <w:szCs w:val="18"/>
               </w:rPr>
@@ -2612,13 +2413,7 @@
         </w:tc>
       </w:tr>
     </w:tbl>
-    <w:p>
-      <w:pPr>
-        <w:rPr>
-          <w:rFonts w:hint="eastAsia"/>
-        </w:rPr>
-      </w:pPr>
-    </w:p>
+    <w:p/>
     <w:p>
       <w:pPr>
         <w:pStyle w:val="-4"/>
@@ -2626,9 +2421,6 @@
           <w:ilvl w:val="0"/>
           <w:numId w:val="4"/>
         </w:numPr>
-        <w:rPr>
-          <w:rFonts w:hint="eastAsia"/>
-        </w:rPr>
       </w:pPr>
       <w:r>
         <w:rPr>
@@ -2640,9 +2432,6 @@
     <w:p>
       <w:pPr>
         <w:pStyle w:val="-5"/>
-        <w:rPr>
-          <w:rFonts w:hint="eastAsia"/>
-        </w:rPr>
       </w:pPr>
       <w:r>
         <w:t>基于策略的强化学习算法与基于值的强化学习算法不同，基于策略的算法直接优化智能体的策略（</w:t>
@@ -2677,9 +2466,6 @@
     <w:p>
       <w:pPr>
         <w:pStyle w:val="-5"/>
-        <w:rPr>
-          <w:rFonts w:hint="eastAsia"/>
-        </w:rPr>
       </w:pPr>
       <w:r>
         <w:t>在基于策略的强化学习中，策略可以是确定性的（每个状态对应一个特定的动作）或随机的（每个状态对应一组动作的概率分布）。这种方法的核心目标是直接优化策略，使智能体能够在不同的状态下选择最优的动作。</w:t>
@@ -2706,9 +2492,6 @@
     <w:p>
       <w:pPr>
         <w:pStyle w:val="-9"/>
-        <w:rPr>
-          <w:rFonts w:hint="eastAsia"/>
-        </w:rPr>
       </w:pPr>
       <w:r>
         <w:rPr>
@@ -2736,7 +2519,6 @@
             <w:pPr>
               <w:jc w:val="center"/>
               <w:rPr>
-                <w:rFonts w:hint="eastAsia"/>
                 <w:sz w:val="18"/>
                 <w:szCs w:val="18"/>
               </w:rPr>
@@ -2759,7 +2541,6 @@
             <w:pPr>
               <w:jc w:val="center"/>
               <w:rPr>
-                <w:rFonts w:hint="eastAsia"/>
                 <w:sz w:val="18"/>
                 <w:szCs w:val="18"/>
               </w:rPr>
@@ -2785,7 +2566,6 @@
             <w:pPr>
               <w:jc w:val="center"/>
               <w:rPr>
-                <w:rFonts w:hint="eastAsia"/>
                 <w:sz w:val="18"/>
                 <w:szCs w:val="18"/>
               </w:rPr>
@@ -2807,7 +2587,6 @@
           <w:p>
             <w:pPr>
               <w:rPr>
-                <w:rFonts w:hint="eastAsia"/>
                 <w:sz w:val="18"/>
                 <w:szCs w:val="18"/>
               </w:rPr>
@@ -2861,7 +2640,6 @@
             <w:pPr>
               <w:jc w:val="center"/>
               <w:rPr>
-                <w:rFonts w:hint="eastAsia"/>
                 <w:sz w:val="18"/>
                 <w:szCs w:val="18"/>
               </w:rPr>
@@ -2885,7 +2663,6 @@
           <w:p>
             <w:pPr>
               <w:rPr>
-                <w:rFonts w:hint="eastAsia"/>
                 <w:sz w:val="18"/>
                 <w:szCs w:val="18"/>
               </w:rPr>
@@ -2914,7 +2691,6 @@
             <w:pPr>
               <w:jc w:val="center"/>
               <w:rPr>
-                <w:rFonts w:hint="eastAsia"/>
                 <w:sz w:val="18"/>
                 <w:szCs w:val="18"/>
               </w:rPr>
@@ -2936,7 +2712,6 @@
           <w:p>
             <w:pPr>
               <w:rPr>
-                <w:rFonts w:hint="eastAsia"/>
                 <w:sz w:val="18"/>
                 <w:szCs w:val="18"/>
               </w:rPr>
@@ -2960,9 +2735,6 @@
           <w:ilvl w:val="0"/>
           <w:numId w:val="4"/>
         </w:numPr>
-        <w:rPr>
-          <w:rFonts w:hint="eastAsia"/>
-        </w:rPr>
       </w:pPr>
       <w:bookmarkStart w:id="2" w:name="OLE_LINK6"/>
       <w:r>
@@ -2983,9 +2755,6 @@
     <w:p>
       <w:pPr>
         <w:pStyle w:val="-5"/>
-        <w:rPr>
-          <w:rFonts w:hint="eastAsia"/>
-        </w:rPr>
       </w:pPr>
       <w:r>
         <w:t>Actor-Critic</w:t>
@@ -3039,9 +2808,6 @@
     <w:p>
       <w:pPr>
         <w:pStyle w:val="-5"/>
-        <w:rPr>
-          <w:rFonts w:hint="eastAsia"/>
-        </w:rPr>
       </w:pPr>
       <w:r>
         <w:t>在</w:t>
@@ -3069,9 +2835,6 @@
       <w:pPr>
         <w:pStyle w:val="-9"/>
         <w:ind w:left="0"/>
-        <w:rPr>
-          <w:rFonts w:hint="eastAsia"/>
-        </w:rPr>
       </w:pPr>
       <w:r>
         <w:rPr>
@@ -3099,7 +2862,6 @@
             <w:pPr>
               <w:jc w:val="center"/>
               <w:rPr>
-                <w:rFonts w:hint="eastAsia"/>
                 <w:sz w:val="18"/>
                 <w:szCs w:val="18"/>
               </w:rPr>
@@ -3122,7 +2884,6 @@
             <w:pPr>
               <w:jc w:val="center"/>
               <w:rPr>
-                <w:rFonts w:hint="eastAsia"/>
                 <w:sz w:val="18"/>
                 <w:szCs w:val="18"/>
               </w:rPr>
@@ -3148,7 +2909,6 @@
             <w:pPr>
               <w:jc w:val="center"/>
               <w:rPr>
-                <w:rFonts w:hint="eastAsia"/>
                 <w:sz w:val="18"/>
                 <w:szCs w:val="18"/>
               </w:rPr>
@@ -3170,7 +2930,6 @@
           <w:p>
             <w:pPr>
               <w:rPr>
-                <w:rFonts w:hint="eastAsia"/>
                 <w:sz w:val="18"/>
                 <w:szCs w:val="18"/>
               </w:rPr>
@@ -3224,7 +2983,6 @@
             <w:pPr>
               <w:jc w:val="center"/>
               <w:rPr>
-                <w:rFonts w:hint="eastAsia"/>
                 <w:sz w:val="18"/>
                 <w:szCs w:val="18"/>
               </w:rPr>
@@ -3246,7 +3004,6 @@
           <w:p>
             <w:pPr>
               <w:rPr>
-                <w:rFonts w:hint="eastAsia"/>
                 <w:sz w:val="18"/>
                 <w:szCs w:val="18"/>
               </w:rPr>
@@ -3272,7 +3029,6 @@
             <w:pPr>
               <w:jc w:val="center"/>
               <w:rPr>
-                <w:rFonts w:hint="eastAsia"/>
                 <w:sz w:val="18"/>
                 <w:szCs w:val="18"/>
               </w:rPr>
@@ -3294,7 +3050,6 @@
           <w:p>
             <w:pPr>
               <w:rPr>
-                <w:rFonts w:hint="eastAsia"/>
                 <w:sz w:val="18"/>
                 <w:szCs w:val="18"/>
               </w:rPr>
@@ -3332,17 +3087,11 @@
     <w:p>
       <w:pPr>
         <w:pStyle w:val="-5"/>
-        <w:rPr>
-          <w:rFonts w:hint="eastAsia"/>
-        </w:rPr>
       </w:pPr>
     </w:p>
     <w:p>
       <w:pPr>
         <w:pStyle w:val="-5"/>
-        <w:rPr>
-          <w:rFonts w:hint="eastAsia"/>
-        </w:rPr>
       </w:pPr>
       <w:bookmarkStart w:id="4" w:name="OLE_LINK11"/>
       <w:r>
@@ -3440,9 +3189,6 @@
     <w:p>
       <w:pPr>
         <w:pStyle w:val="-3"/>
-        <w:rPr>
-          <w:rFonts w:hint="eastAsia"/>
-        </w:rPr>
       </w:pPr>
       <w:r>
         <w:rPr>
@@ -3460,9 +3206,6 @@
     <w:p>
       <w:pPr>
         <w:pStyle w:val="-5"/>
-        <w:rPr>
-          <w:rFonts w:hint="eastAsia"/>
-        </w:rPr>
       </w:pPr>
       <w:r>
         <w:rPr>
@@ -3528,9 +3271,6 @@
     <w:p>
       <w:pPr>
         <w:pStyle w:val="-4"/>
-        <w:rPr>
-          <w:rFonts w:hint="eastAsia"/>
-        </w:rPr>
       </w:pPr>
       <w:r>
         <w:rPr>
@@ -3560,9 +3300,6 @@
     <w:p>
       <w:pPr>
         <w:pStyle w:val="-5"/>
-        <w:rPr>
-          <w:rFonts w:hint="eastAsia"/>
-        </w:rPr>
       </w:pPr>
       <w:r>
         <w:rPr>
@@ -3607,7 +3344,6 @@
         <w:pStyle w:val="-5"/>
         <w:ind w:firstLineChars="0" w:firstLine="0"/>
         <w:rPr>
-          <w:rFonts w:hint="eastAsia"/>
           <w:b/>
           <w:bCs/>
         </w:rPr>
@@ -3627,9 +3363,6 @@
           <w:ilvl w:val="0"/>
           <w:numId w:val="5"/>
         </w:numPr>
-        <w:rPr>
-          <w:rFonts w:hint="eastAsia"/>
-        </w:rPr>
       </w:pPr>
       <w:r>
         <w:rPr>
@@ -3712,7 +3445,6 @@
         <w:pStyle w:val="-5"/>
         <w:ind w:firstLine="422"/>
         <w:rPr>
-          <w:rFonts w:hint="eastAsia"/>
           <w:b/>
           <w:bCs/>
         </w:rPr>
@@ -3745,7 +3477,6 @@
     <w:p>
       <w:pPr>
         <w:rPr>
-          <w:rFonts w:hint="eastAsia"/>
           <w:i/>
           <w:iCs/>
         </w:rPr>
@@ -3867,9 +3598,6 @@
     <w:p>
       <w:pPr>
         <w:ind w:firstLineChars="200" w:firstLine="420"/>
-        <w:rPr>
-          <w:rFonts w:hint="eastAsia"/>
-        </w:rPr>
       </w:pPr>
       <w:r>
         <w:rPr>
@@ -3886,9 +3614,6 @@
           <w:numId w:val="6"/>
         </w:numPr>
         <w:ind w:left="840" w:firstLineChars="0"/>
-        <w:rPr>
-          <w:rFonts w:hint="eastAsia"/>
-        </w:rPr>
       </w:pPr>
       <m:oMath>
         <m:r>
@@ -3916,9 +3641,6 @@
           <w:numId w:val="6"/>
         </w:numPr>
         <w:ind w:left="840" w:firstLineChars="0"/>
-        <w:rPr>
-          <w:rFonts w:hint="eastAsia"/>
-        </w:rPr>
       </w:pPr>
       <m:oMath>
         <m:r>
@@ -3946,9 +3668,6 @@
           <w:numId w:val="6"/>
         </w:numPr>
         <w:ind w:left="840" w:firstLineChars="0"/>
-        <w:rPr>
-          <w:rFonts w:hint="eastAsia"/>
-        </w:rPr>
       </w:pPr>
       <m:oMath>
         <m:r>
@@ -3986,7 +3705,6 @@
         </w:numPr>
         <w:ind w:firstLineChars="0"/>
         <w:rPr>
-          <w:rFonts w:hint="eastAsia"/>
           <w:b/>
           <w:bCs/>
         </w:rPr>
@@ -4102,9 +3820,6 @@
     <w:p>
       <w:pPr>
         <w:pStyle w:val="-5"/>
-        <w:rPr>
-          <w:rFonts w:hint="eastAsia"/>
-        </w:rPr>
       </w:pPr>
       <w:r>
         <w:rPr>
@@ -4134,9 +3849,6 @@
           <w:ilvl w:val="0"/>
           <w:numId w:val="8"/>
         </w:numPr>
-        <w:rPr>
-          <w:rFonts w:hint="eastAsia"/>
-        </w:rPr>
       </w:pPr>
       <w:r>
         <w:rPr>
@@ -4151,9 +3863,6 @@
     <w:p>
       <w:pPr>
         <w:pStyle w:val="-5"/>
-        <w:rPr>
-          <w:rFonts w:hint="eastAsia"/>
-        </w:rPr>
       </w:pPr>
       <w:r>
         <w:t>DQN</w:t>
@@ -4206,9 +3915,6 @@
         <w:pStyle w:val="-5"/>
         <w:ind w:firstLineChars="0" w:firstLine="0"/>
         <w:jc w:val="center"/>
-        <w:rPr>
-          <w:rFonts w:hint="eastAsia"/>
-        </w:rPr>
       </w:pPr>
       <w:r>
         <w:rPr>
@@ -4264,9 +3970,6 @@
       <w:pPr>
         <w:pStyle w:val="-7"/>
         <w:ind w:firstLineChars="0" w:firstLine="0"/>
-        <w:rPr>
-          <w:rFonts w:hint="eastAsia"/>
-        </w:rPr>
       </w:pPr>
       <w:r>
         <w:rPr>
@@ -4295,9 +3998,6 @@
           <w:numId w:val="9"/>
         </w:numPr>
         <w:ind w:firstLineChars="0"/>
-        <w:rPr>
-          <w:rFonts w:hint="eastAsia"/>
-        </w:rPr>
       </w:pPr>
       <w:r>
         <w:rPr>
@@ -4310,9 +4010,6 @@
     <w:p>
       <w:pPr>
         <w:pStyle w:val="-5"/>
-        <w:rPr>
-          <w:rFonts w:hint="eastAsia"/>
-        </w:rPr>
       </w:pPr>
       <w:r>
         <w:rPr>
@@ -4357,9 +4054,6 @@
           <w:ilvl w:val="0"/>
           <w:numId w:val="10"/>
         </w:numPr>
-        <w:rPr>
-          <w:rFonts w:hint="eastAsia"/>
-        </w:rPr>
       </w:pPr>
       <w:r>
         <w:rPr>
@@ -4381,9 +4075,6 @@
           <w:ilvl w:val="0"/>
           <w:numId w:val="10"/>
         </w:numPr>
-        <w:rPr>
-          <w:rFonts w:hint="eastAsia"/>
-        </w:rPr>
       </w:pPr>
       <w:r>
         <w:rPr>
@@ -4437,7 +4128,6 @@
         <w:ind w:firstLineChars="0"/>
         <w:rPr>
           <w:rStyle w:val="a9"/>
-          <w:rFonts w:hint="eastAsia"/>
         </w:rPr>
       </w:pPr>
       <w:r>
@@ -4463,9 +4153,6 @@
     <w:p>
       <w:pPr>
         <w:pStyle w:val="-5"/>
-        <w:rPr>
-          <w:rFonts w:hint="eastAsia"/>
-        </w:rPr>
       </w:pPr>
       <w:r>
         <w:t>经验回放</w:t>
@@ -4507,7 +4194,6 @@
         <w:ind w:firstLineChars="0"/>
         <w:rPr>
           <w:rStyle w:val="a9"/>
-          <w:rFonts w:hint="eastAsia"/>
         </w:rPr>
       </w:pPr>
       <w:r>
@@ -4550,9 +4236,6 @@
           <w:numId w:val="11"/>
         </w:numPr>
         <w:ind w:left="0" w:firstLine="420"/>
-        <w:rPr>
-          <w:rFonts w:hint="eastAsia"/>
-        </w:rPr>
       </w:pPr>
       <w:r>
         <w:rPr>
@@ -4599,9 +4282,6 @@
           <w:numId w:val="11"/>
         </w:numPr>
         <w:ind w:left="0" w:firstLine="420"/>
-        <w:rPr>
-          <w:rFonts w:hint="eastAsia"/>
-        </w:rPr>
       </w:pPr>
       <w:r>
         <w:t>在线网络（</w:t>
@@ -4639,9 +4319,6 @@
           <w:numId w:val="11"/>
         </w:numPr>
         <w:ind w:left="0" w:firstLine="420"/>
-        <w:rPr>
-          <w:rFonts w:hint="eastAsia"/>
-        </w:rPr>
       </w:pPr>
       <w:r>
         <w:rPr>
@@ -4707,7 +4384,6 @@
         </w:numPr>
         <w:ind w:firstLineChars="0"/>
         <w:rPr>
-          <w:rFonts w:hint="eastAsia"/>
           <w:b/>
           <w:bCs/>
         </w:rPr>
@@ -4737,9 +4413,6 @@
     <w:p>
       <w:pPr>
         <w:pStyle w:val="-5"/>
-        <w:rPr>
-          <w:rFonts w:hint="eastAsia"/>
-        </w:rPr>
       </w:pPr>
       <w:r>
         <w:rPr>
@@ -4881,9 +4554,6 @@
     <w:p>
       <w:pPr>
         <w:pStyle w:val="-4"/>
-        <w:rPr>
-          <w:rFonts w:hint="eastAsia"/>
-        </w:rPr>
       </w:pPr>
       <w:r>
         <w:rPr>
@@ -4907,9 +4577,6 @@
     <w:p>
       <w:pPr>
         <w:pStyle w:val="-5"/>
-        <w:rPr>
-          <w:rFonts w:hint="eastAsia"/>
-        </w:rPr>
       </w:pPr>
       <w:r>
         <w:rPr>
@@ -4978,9 +4645,6 @@
       <w:pPr>
         <w:pStyle w:val="-5"/>
         <w:ind w:firstLineChars="0"/>
-        <w:rPr>
-          <w:rFonts w:hint="eastAsia"/>
-        </w:rPr>
       </w:pPr>
       <w:r>
         <w:rPr>
@@ -5068,9 +4732,6 @@
         <w:pStyle w:val="-5"/>
         <w:ind w:firstLineChars="0" w:firstLine="0"/>
         <w:jc w:val="center"/>
-        <w:rPr>
-          <w:rFonts w:hint="eastAsia"/>
-        </w:rPr>
       </w:pPr>
       <w:r>
         <w:rPr>
@@ -5123,9 +4784,6 @@
     <w:p>
       <w:pPr>
         <w:pStyle w:val="-7"/>
-        <w:rPr>
-          <w:rFonts w:hint="eastAsia"/>
-        </w:rPr>
       </w:pPr>
       <w:r>
         <w:rPr>
@@ -5150,9 +4808,6 @@
       <w:pPr>
         <w:pStyle w:val="-5"/>
         <w:ind w:firstLineChars="0"/>
-        <w:rPr>
-          <w:rFonts w:hint="eastAsia"/>
-        </w:rPr>
       </w:pPr>
       <w:r>
         <w:rPr>
@@ -5319,9 +4974,6 @@
         <w:pStyle w:val="-5"/>
         <w:ind w:firstLineChars="0" w:firstLine="0"/>
         <w:jc w:val="center"/>
-        <w:rPr>
-          <w:rFonts w:hint="eastAsia"/>
-        </w:rPr>
       </w:pPr>
       <w:r>
         <w:rPr>
@@ -5374,9 +5026,6 @@
     <w:p>
       <w:pPr>
         <w:pStyle w:val="-7"/>
-        <w:rPr>
-          <w:rFonts w:hint="eastAsia"/>
-        </w:rPr>
       </w:pPr>
       <w:r>
         <w:rPr>
@@ -5401,9 +5050,6 @@
       <w:pPr>
         <w:pStyle w:val="-5"/>
         <w:ind w:firstLineChars="0"/>
-        <w:rPr>
-          <w:rFonts w:hint="eastAsia"/>
-        </w:rPr>
       </w:pPr>
       <w:r>
         <w:rPr>
@@ -5533,9 +5179,6 @@
         <w:pStyle w:val="-5"/>
         <w:ind w:firstLineChars="0" w:firstLine="0"/>
         <w:jc w:val="center"/>
-        <w:rPr>
-          <w:rFonts w:hint="eastAsia"/>
-        </w:rPr>
       </w:pPr>
       <w:r>
         <w:rPr>
@@ -5588,9 +5231,6 @@
     <w:p>
       <w:pPr>
         <w:pStyle w:val="-7"/>
-        <w:rPr>
-          <w:rFonts w:hint="eastAsia"/>
-        </w:rPr>
       </w:pPr>
       <w:r>
         <w:rPr>
@@ -5614,9 +5254,6 @@
     <w:p>
       <w:pPr>
         <w:pStyle w:val="-4"/>
-        <w:rPr>
-          <w:rFonts w:hint="eastAsia"/>
-        </w:rPr>
       </w:pPr>
       <w:bookmarkStart w:id="7" w:name="OLE_LINK9"/>
       <w:r>
@@ -5642,9 +5279,6 @@
     <w:p>
       <w:pPr>
         <w:pStyle w:val="-5"/>
-        <w:rPr>
-          <w:rFonts w:hint="eastAsia"/>
-        </w:rPr>
       </w:pPr>
       <w:r>
         <w:rPr>
@@ -5703,9 +5337,6 @@
           <w:numId w:val="12"/>
         </w:numPr>
         <w:ind w:firstLineChars="0"/>
-        <w:rPr>
-          <w:rFonts w:hint="eastAsia"/>
-        </w:rPr>
       </w:pPr>
       <w:proofErr w:type="spellStart"/>
       <w:r>
@@ -5796,9 +5427,6 @@
           <w:numId w:val="12"/>
         </w:numPr>
         <w:ind w:firstLine="420"/>
-        <w:rPr>
-          <w:rFonts w:hint="eastAsia"/>
-        </w:rPr>
       </w:pPr>
       <w:r>
         <w:rPr>
@@ -5833,9 +5461,6 @@
           <w:numId w:val="12"/>
         </w:numPr>
         <w:ind w:firstLine="420"/>
-        <w:rPr>
-          <w:rFonts w:hint="eastAsia"/>
-        </w:rPr>
       </w:pPr>
       <w:r>
         <w:rPr>
@@ -5908,9 +5533,6 @@
           <w:numId w:val="12"/>
         </w:numPr>
         <w:ind w:firstLine="420"/>
-        <w:rPr>
-          <w:rFonts w:hint="eastAsia"/>
-        </w:rPr>
       </w:pPr>
       <w:r>
         <w:rPr>
@@ -5947,9 +5569,6 @@
           <w:numId w:val="12"/>
         </w:numPr>
         <w:ind w:firstLineChars="0"/>
-        <w:rPr>
-          <w:rFonts w:hint="eastAsia"/>
-        </w:rPr>
       </w:pPr>
       <w:r>
         <w:t>reset()</w:t>
@@ -5990,9 +5609,6 @@
           <w:numId w:val="13"/>
         </w:numPr>
         <w:ind w:firstLineChars="0"/>
-        <w:rPr>
-          <w:rFonts w:hint="eastAsia"/>
-        </w:rPr>
       </w:pPr>
       <w:r>
         <w:t>step(action)</w:t>
@@ -6024,9 +5640,6 @@
           <w:numId w:val="13"/>
         </w:numPr>
         <w:ind w:firstLineChars="0"/>
-        <w:rPr>
-          <w:rFonts w:hint="eastAsia"/>
-        </w:rPr>
       </w:pPr>
       <w:r>
         <w:rPr>
@@ -6054,9 +5667,6 @@
       <w:pPr>
         <w:pStyle w:val="-5"/>
         <w:ind w:firstLineChars="0"/>
-        <w:rPr>
-          <w:rFonts w:hint="eastAsia"/>
-        </w:rPr>
       </w:pPr>
       <w:r>
         <w:rPr>
@@ -6678,9 +6288,6 @@
     <w:p>
       <w:pPr>
         <w:pStyle w:val="-4"/>
-        <w:rPr>
-          <w:rFonts w:hint="eastAsia"/>
-        </w:rPr>
       </w:pPr>
       <w:r>
         <w:rPr>
@@ -6698,9 +6305,6 @@
     <w:p>
       <w:pPr>
         <w:pStyle w:val="-5"/>
-        <w:rPr>
-          <w:rFonts w:hint="eastAsia"/>
-        </w:rPr>
       </w:pPr>
       <w:r>
         <w:rPr>
@@ -6712,9 +6316,6 @@
     <w:p>
       <w:pPr>
         <w:pStyle w:val="-4"/>
-        <w:rPr>
-          <w:rFonts w:hint="eastAsia"/>
-        </w:rPr>
       </w:pPr>
       <w:r>
         <w:rPr>
@@ -6752,7 +6353,6 @@
         <w:pStyle w:val="-5"/>
         <w:rPr>
           <w:rStyle w:val="-6"/>
-          <w:rFonts w:hint="eastAsia"/>
         </w:rPr>
       </w:pPr>
       <w:r>
@@ -6765,9 +6365,6 @@
     <w:p>
       <w:pPr>
         <w:pStyle w:val="-4"/>
-        <w:rPr>
-          <w:rFonts w:hint="eastAsia"/>
-        </w:rPr>
       </w:pPr>
       <w:r>
         <w:rPr>
@@ -6819,7 +6416,6 @@
         <w:pStyle w:val="-5"/>
         <w:rPr>
           <w:rStyle w:val="-6"/>
-          <w:rFonts w:hint="eastAsia"/>
         </w:rPr>
       </w:pPr>
       <w:r>
@@ -6832,9 +6428,6 @@
     <w:p>
       <w:pPr>
         <w:pStyle w:val="-4"/>
-        <w:rPr>
-          <w:rFonts w:hint="eastAsia"/>
-        </w:rPr>
       </w:pPr>
       <w:r>
         <w:rPr>
@@ -6884,9 +6477,6 @@
     <w:p>
       <w:pPr>
         <w:pStyle w:val="-5"/>
-        <w:rPr>
-          <w:rFonts w:hint="eastAsia"/>
-        </w:rPr>
       </w:pPr>
       <w:r>
         <w:rPr>
@@ -6898,9 +6488,6 @@
     <w:p>
       <w:pPr>
         <w:pStyle w:val="-4"/>
-        <w:rPr>
-          <w:rFonts w:hint="eastAsia"/>
-        </w:rPr>
       </w:pPr>
       <w:r>
         <w:rPr>
@@ -6936,9 +6523,6 @@
     <w:p>
       <w:pPr>
         <w:pStyle w:val="-5"/>
-        <w:rPr>
-          <w:rFonts w:hint="eastAsia"/>
-        </w:rPr>
       </w:pPr>
       <w:r>
         <w:rPr>
@@ -6964,9 +6548,6 @@
     <w:p>
       <w:pPr>
         <w:pStyle w:val="-2"/>
-        <w:rPr>
-          <w:rFonts w:hint="eastAsia"/>
-        </w:rPr>
       </w:pPr>
       <w:r>
         <w:rPr>
@@ -6985,164 +6566,158 @@
       <w:pPr>
         <w:pStyle w:val="3"/>
         <w:spacing w:before="0" w:after="0" w:line="415" w:lineRule="auto"/>
+        <w:rPr>
+          <w:rFonts w:eastAsia="宋体"/>
+          <w:sz w:val="24"/>
+          <w:szCs w:val="24"/>
+        </w:rPr>
+      </w:pPr>
+      <w:r>
         <w:rPr>
           <w:rFonts w:eastAsia="宋体" w:hint="eastAsia"/>
           <w:sz w:val="24"/>
           <w:szCs w:val="24"/>
         </w:rPr>
-      </w:pPr>
+        <w:t xml:space="preserve">8.4.1 </w:t>
+      </w:r>
       <w:r>
         <w:rPr>
           <w:rFonts w:eastAsia="宋体" w:hint="eastAsia"/>
           <w:sz w:val="24"/>
           <w:szCs w:val="24"/>
         </w:rPr>
-        <w:t xml:space="preserve">8.4.1 </w:t>
-      </w:r>
+        <w:t>环境配置</w:t>
+      </w:r>
+    </w:p>
+    <w:p>
+      <w:pPr>
+        <w:pStyle w:val="-5"/>
+      </w:pPr>
+      <w:r>
+        <w:t>在本实验中，使用了</w:t>
+      </w:r>
+      <w:r>
+        <w:t>gym</w:t>
+      </w:r>
+      <w:r>
+        <w:t>库来创建和控制一个强化学习环境。具体选择了</w:t>
+      </w:r>
+      <w:r>
+        <w:t xml:space="preserve"> MountainCar-v0</w:t>
+      </w:r>
+      <w:r>
+        <w:t>环境，这是一个经典的强化学习任务，涉及到一个小车在一个山谷中，目标是通过控制加速使小车成功到达山顶。</w:t>
+      </w:r>
+      <w:r>
+        <w:rPr>
+          <w:rFonts w:hint="eastAsia"/>
+        </w:rPr>
+        <w:t>以下代码展示了本实验所需的依赖包。</w:t>
+      </w:r>
+    </w:p>
+    <w:p>
+      <w:pPr>
+        <w:pStyle w:val="-"/>
+        <w:rPr>
+          <w:rFonts w:eastAsiaTheme="minorEastAsia"/>
+          <w:lang w:eastAsia="zh-CN"/>
+        </w:rPr>
+      </w:pPr>
+      <w:r>
+        <w:rPr>
+          <w:rFonts w:eastAsiaTheme="minorEastAsia" w:hint="eastAsia"/>
+          <w:lang w:eastAsia="zh-CN"/>
+        </w:rPr>
+        <w:t>#</w:t>
+      </w:r>
+      <w:r>
+        <w:rPr>
+          <w:rFonts w:eastAsiaTheme="minorEastAsia" w:hint="eastAsia"/>
+          <w:lang w:eastAsia="zh-CN"/>
+        </w:rPr>
+        <w:t>安装依赖包</w:t>
+      </w:r>
+    </w:p>
+    <w:p>
+      <w:pPr>
+        <w:pStyle w:val="-"/>
+        <w:rPr>
+          <w:rFonts w:eastAsiaTheme="minorEastAsia"/>
+          <w:lang w:eastAsia="zh-CN"/>
+        </w:rPr>
+      </w:pPr>
+      <w:r>
+        <w:lastRenderedPageBreak/>
+        <w:t xml:space="preserve">pip install torch </w:t>
+      </w:r>
+      <w:proofErr w:type="spellStart"/>
+      <w:r>
+        <w:t>torchvision</w:t>
+      </w:r>
+      <w:proofErr w:type="spellEnd"/>
+      <w:r>
+        <w:t xml:space="preserve"> </w:t>
+      </w:r>
+      <w:proofErr w:type="spellStart"/>
+      <w:r>
+        <w:t>torchaudio</w:t>
+      </w:r>
+      <w:proofErr w:type="spellEnd"/>
+      <w:r>
+        <w:t xml:space="preserve"> gym matplotlib </w:t>
+      </w:r>
+      <w:proofErr w:type="spellStart"/>
+      <w:r>
+        <w:t>numpy</w:t>
+      </w:r>
+      <w:proofErr w:type="spellEnd"/>
+      <w:r>
+        <w:rPr>
+          <w:rFonts w:eastAsiaTheme="minorEastAsia" w:hint="eastAsia"/>
+          <w:lang w:eastAsia="zh-CN"/>
+        </w:rPr>
+        <w:t xml:space="preserve"> </w:t>
+      </w:r>
+      <w:proofErr w:type="spellStart"/>
+      <w:r>
+        <w:rPr>
+          <w:rFonts w:eastAsiaTheme="minorEastAsia" w:hint="eastAsia"/>
+          <w:lang w:eastAsia="zh-CN"/>
+        </w:rPr>
+        <w:t>pygame</w:t>
+      </w:r>
+      <w:proofErr w:type="spellEnd"/>
+    </w:p>
+    <w:p>
+      <w:pPr>
+        <w:pStyle w:val="3"/>
+        <w:spacing w:before="0" w:after="0" w:line="415" w:lineRule="auto"/>
+        <w:rPr>
+          <w:rFonts w:eastAsia="宋体"/>
+          <w:sz w:val="24"/>
+          <w:szCs w:val="24"/>
+        </w:rPr>
+      </w:pPr>
       <w:r>
         <w:rPr>
           <w:rFonts w:eastAsia="宋体" w:hint="eastAsia"/>
           <w:sz w:val="24"/>
           <w:szCs w:val="24"/>
         </w:rPr>
-        <w:t>环境配置</w:t>
-      </w:r>
-    </w:p>
-    <w:p>
-      <w:pPr>
-        <w:pStyle w:val="-5"/>
-        <w:rPr>
-          <w:rFonts w:hint="eastAsia"/>
-        </w:rPr>
-      </w:pPr>
-      <w:r>
-        <w:t>在本实验中，使用了</w:t>
-      </w:r>
-      <w:r>
-        <w:t>gym</w:t>
-      </w:r>
-      <w:r>
-        <w:t>库来创建和控制一个强化学习环境。具体选择了</w:t>
-      </w:r>
-      <w:r>
-        <w:t xml:space="preserve"> MountainCar-v0</w:t>
-      </w:r>
-      <w:r>
-        <w:t>环境，这是一个经典的强化学习任务，涉及到一个小车在一个山谷中，目标是通过控制加速使小车成功到达山顶。</w:t>
-      </w:r>
-      <w:r>
-        <w:rPr>
-          <w:rFonts w:hint="eastAsia"/>
-        </w:rPr>
-        <w:t>以下代码展示了本实验所需的依赖包。</w:t>
-      </w:r>
-    </w:p>
-    <w:p>
-      <w:pPr>
-        <w:pStyle w:val="-"/>
-        <w:rPr>
-          <w:rFonts w:eastAsiaTheme="minorEastAsia"/>
-          <w:lang w:eastAsia="zh-CN"/>
-        </w:rPr>
-      </w:pPr>
-      <w:r>
-        <w:rPr>
-          <w:rFonts w:eastAsiaTheme="minorEastAsia" w:hint="eastAsia"/>
-          <w:lang w:eastAsia="zh-CN"/>
-        </w:rPr>
-        <w:t>#</w:t>
-      </w:r>
-      <w:r>
-        <w:rPr>
-          <w:rFonts w:eastAsiaTheme="minorEastAsia" w:hint="eastAsia"/>
-          <w:lang w:eastAsia="zh-CN"/>
-        </w:rPr>
-        <w:t>安装依赖包</w:t>
-      </w:r>
-    </w:p>
-    <w:p>
-      <w:pPr>
-        <w:pStyle w:val="-"/>
-        <w:rPr>
-          <w:rFonts w:eastAsiaTheme="minorEastAsia" w:hint="eastAsia"/>
-          <w:lang w:eastAsia="zh-CN"/>
-        </w:rPr>
-      </w:pPr>
-      <w:r>
-        <w:lastRenderedPageBreak/>
-        <w:t xml:space="preserve">pip install torch </w:t>
-      </w:r>
-      <w:proofErr w:type="spellStart"/>
-      <w:r>
-        <w:t>torchvision</w:t>
-      </w:r>
-      <w:proofErr w:type="spellEnd"/>
-      <w:r>
-        <w:t xml:space="preserve"> </w:t>
-      </w:r>
-      <w:proofErr w:type="spellStart"/>
-      <w:r>
-        <w:t>torchaudio</w:t>
-      </w:r>
-      <w:proofErr w:type="spellEnd"/>
-      <w:r>
-        <w:t xml:space="preserve"> gym matplotlib </w:t>
-      </w:r>
-      <w:proofErr w:type="spellStart"/>
-      <w:r>
-        <w:t>numpy</w:t>
-      </w:r>
-      <w:proofErr w:type="spellEnd"/>
-      <w:r>
-        <w:rPr>
-          <w:rFonts w:eastAsiaTheme="minorEastAsia" w:hint="eastAsia"/>
-          <w:lang w:eastAsia="zh-CN"/>
-        </w:rPr>
-        <w:t xml:space="preserve"> </w:t>
-      </w:r>
-      <w:proofErr w:type="spellStart"/>
-      <w:r>
-        <w:rPr>
-          <w:rFonts w:eastAsiaTheme="minorEastAsia" w:hint="eastAsia"/>
-          <w:lang w:eastAsia="zh-CN"/>
-        </w:rPr>
-        <w:t>pygame</w:t>
-      </w:r>
-      <w:proofErr w:type="spellEnd"/>
-    </w:p>
-    <w:p>
-      <w:pPr>
-        <w:pStyle w:val="3"/>
-        <w:spacing w:before="0" w:after="0" w:line="415" w:lineRule="auto"/>
+        <w:t xml:space="preserve">8.4.2 </w:t>
+      </w:r>
+      <w:r>
         <w:rPr>
           <w:rFonts w:eastAsia="宋体" w:hint="eastAsia"/>
           <w:sz w:val="24"/>
           <w:szCs w:val="24"/>
         </w:rPr>
-      </w:pPr>
-      <w:r>
-        <w:rPr>
-          <w:rFonts w:eastAsia="宋体" w:hint="eastAsia"/>
-          <w:sz w:val="24"/>
-          <w:szCs w:val="24"/>
-        </w:rPr>
-        <w:t xml:space="preserve">8.4.2 </w:t>
-      </w:r>
-      <w:r>
-        <w:rPr>
-          <w:rFonts w:eastAsia="宋体" w:hint="eastAsia"/>
-          <w:sz w:val="24"/>
-          <w:szCs w:val="24"/>
-        </w:rPr>
         <w:t>模型搭建</w:t>
       </w:r>
     </w:p>
     <w:p>
       <w:pPr>
         <w:pStyle w:val="-5"/>
-        <w:rPr>
-          <w:rFonts w:hint="eastAsia"/>
-        </w:rPr>
       </w:pPr>
       <w:r>
         <w:rPr>
@@ -7570,9 +7145,6 @@
     <w:p>
       <w:pPr>
         <w:pStyle w:val="-5"/>
-        <w:rPr>
-          <w:rFonts w:hint="eastAsia"/>
-        </w:rPr>
       </w:pPr>
       <w:r>
         <w:rPr>
@@ -8036,9 +7608,6 @@
     <w:p>
       <w:pPr>
         <w:pStyle w:val="-5"/>
-        <w:rPr>
-          <w:rFonts w:hint="eastAsia"/>
-        </w:rPr>
       </w:pPr>
       <w:r>
         <w:rPr>
@@ -8607,9 +8176,6 @@
     <w:p>
       <w:pPr>
         <w:pStyle w:val="-5"/>
-        <w:rPr>
-          <w:rFonts w:hint="eastAsia"/>
-        </w:rPr>
       </w:pPr>
       <w:r>
         <w:rPr>
@@ -9244,9 +8810,6 @@
     <w:p>
       <w:pPr>
         <w:pStyle w:val="-5"/>
-        <w:rPr>
-          <w:rFonts w:hint="eastAsia"/>
-        </w:rPr>
       </w:pPr>
       <w:r>
         <w:rPr>
@@ -9665,9 +9228,6 @@
     <w:p>
       <w:pPr>
         <w:pStyle w:val="-5"/>
-        <w:rPr>
-          <w:rFonts w:hint="eastAsia"/>
-        </w:rPr>
       </w:pPr>
       <w:r>
         <w:rPr>
@@ -9924,7 +9484,7 @@
         <w:pStyle w:val="-"/>
         <w:ind w:firstLine="360"/>
         <w:rPr>
-          <w:rFonts w:ascii="宋体" w:eastAsia="宋体" w:hAnsi="宋体" w:cs="宋体" w:hint="eastAsia"/>
+          <w:rFonts w:ascii="宋体" w:eastAsia="宋体" w:hAnsi="宋体" w:cs="宋体"/>
           <w:lang w:eastAsia="zh-CN"/>
         </w:rPr>
       </w:pPr>
@@ -9939,9 +9499,6 @@
     <w:p>
       <w:pPr>
         <w:pStyle w:val="-4"/>
-        <w:rPr>
-          <w:rFonts w:hint="eastAsia"/>
-        </w:rPr>
       </w:pPr>
       <w:r>
         <w:rPr>
@@ -9959,9 +9516,6 @@
     <w:p>
       <w:pPr>
         <w:pStyle w:val="-5"/>
-        <w:rPr>
-          <w:rFonts w:hint="eastAsia"/>
-        </w:rPr>
       </w:pPr>
       <w:r>
         <w:t>训练过程中，策略网络和目标网络被分开使用，并定期更新目标网络的权重。</w:t>
@@ -11585,7 +11139,6 @@
         </w:rPr>
         <w:t>将数据转换为</w:t>
       </w:r>
-      <w:proofErr w:type="spellStart"/>
       <w:r>
         <w:rPr>
           <w:rFonts w:hint="eastAsia"/>
@@ -11593,7 +11146,6 @@
         </w:rPr>
         <w:t>PyTorch</w:t>
       </w:r>
-      <w:proofErr w:type="spellEnd"/>
       <w:r>
         <w:rPr>
           <w:rFonts w:ascii="宋体" w:eastAsia="宋体" w:hAnsi="宋体" w:cs="宋体" w:hint="eastAsia"/>
@@ -12845,35 +12397,32 @@
       <w:pPr>
         <w:pStyle w:val="3"/>
         <w:spacing w:before="0" w:after="0" w:line="415" w:lineRule="auto"/>
+        <w:rPr>
+          <w:rFonts w:eastAsia="宋体"/>
+          <w:sz w:val="24"/>
+          <w:szCs w:val="24"/>
+        </w:rPr>
+      </w:pPr>
+      <w:r>
         <w:rPr>
           <w:rFonts w:eastAsia="宋体" w:hint="eastAsia"/>
           <w:sz w:val="24"/>
           <w:szCs w:val="24"/>
         </w:rPr>
-      </w:pPr>
+        <w:t xml:space="preserve">8.4.4 </w:t>
+      </w:r>
       <w:r>
         <w:rPr>
           <w:rFonts w:eastAsia="宋体" w:hint="eastAsia"/>
           <w:sz w:val="24"/>
           <w:szCs w:val="24"/>
         </w:rPr>
-        <w:t xml:space="preserve">8.4.4 </w:t>
-      </w:r>
-      <w:r>
-        <w:rPr>
-          <w:rFonts w:eastAsia="宋体" w:hint="eastAsia"/>
-          <w:sz w:val="24"/>
-          <w:szCs w:val="24"/>
-        </w:rPr>
         <w:t>模型测试</w:t>
       </w:r>
     </w:p>
     <w:p>
       <w:pPr>
         <w:pStyle w:val="-5"/>
-        <w:rPr>
-          <w:rFonts w:hint="eastAsia"/>
-        </w:rPr>
       </w:pPr>
       <w:r>
         <w:t>在测试阶段，设置</w:t>
@@ -13729,9 +13278,102 @@
         <w:pStyle w:val="-"/>
         <w:ind w:firstLine="360"/>
         <w:rPr>
+          <w:rFonts w:ascii="宋体" w:eastAsia="宋体" w:hAnsi="宋体" w:cs="宋体"/>
+        </w:rPr>
+      </w:pPr>
+      <w:proofErr w:type="spellStart"/>
+      <w:r>
+        <w:rPr>
+          <w:rFonts w:hint="eastAsia"/>
+        </w:rPr>
+        <w:t>success_rate</w:t>
+      </w:r>
+      <w:proofErr w:type="spellEnd"/>
+      <w:r>
+        <w:rPr>
+          <w:rFonts w:hint="eastAsia"/>
+        </w:rPr>
+        <w:t xml:space="preserve"> = </w:t>
+      </w:r>
+      <w:proofErr w:type="spellStart"/>
+      <w:r>
+        <w:rPr>
+          <w:rFonts w:hint="eastAsia"/>
+        </w:rPr>
+        <w:t>success_count</w:t>
+      </w:r>
+      <w:proofErr w:type="spellEnd"/>
+      <w:r>
+        <w:rPr>
+          <w:rFonts w:hint="eastAsia"/>
+        </w:rPr>
+        <w:t xml:space="preserve"> / </w:t>
+      </w:r>
+      <w:proofErr w:type="gramStart"/>
+      <w:r>
+        <w:rPr>
+          <w:rFonts w:hint="eastAsia"/>
+        </w:rPr>
+        <w:t>10.0  #</w:t>
+      </w:r>
+      <w:proofErr w:type="gramEnd"/>
+      <w:r>
+        <w:rPr>
+          <w:rFonts w:hint="eastAsia"/>
+        </w:rPr>
+        <w:t xml:space="preserve"> </w:t>
+      </w:r>
+      <w:proofErr w:type="spellStart"/>
+      <w:r>
+        <w:rPr>
           <w:rFonts w:ascii="宋体" w:eastAsia="宋体" w:hAnsi="宋体" w:cs="宋体" w:hint="eastAsia"/>
         </w:rPr>
-      </w:pPr>
+        <w:t>成功率</w:t>
+      </w:r>
+      <w:proofErr w:type="spellEnd"/>
+    </w:p>
+    <w:p>
+      <w:pPr>
+        <w:pStyle w:val="-"/>
+        <w:ind w:firstLine="360"/>
+        <w:rPr>
+          <w:rFonts w:ascii="宋体" w:eastAsia="宋体" w:hAnsi="宋体" w:cs="宋体"/>
+          <w:lang w:eastAsia="zh-CN"/>
+        </w:rPr>
+      </w:pPr>
+    </w:p>
+    <w:p>
+      <w:pPr>
+        <w:pStyle w:val="-"/>
+      </w:pPr>
+      <w:r>
+        <w:rPr>
+          <w:rFonts w:hint="eastAsia"/>
+        </w:rPr>
+        <w:t xml:space="preserve">    </w:t>
+      </w:r>
+      <w:proofErr w:type="gramStart"/>
+      <w:r>
+        <w:rPr>
+          <w:rFonts w:hint="eastAsia"/>
+        </w:rPr>
+        <w:t>print(</w:t>
+      </w:r>
+      <w:proofErr w:type="spellStart"/>
+      <w:proofErr w:type="gramEnd"/>
+      <w:r>
+        <w:rPr>
+          <w:rFonts w:hint="eastAsia"/>
+        </w:rPr>
+        <w:t>f"Test</w:t>
+      </w:r>
+      <w:proofErr w:type="spellEnd"/>
+      <w:r>
+        <w:rPr>
+          <w:rFonts w:hint="eastAsia"/>
+        </w:rPr>
+        <w:t xml:space="preserve"> Results - Avg Reward: {avg_reward:.2f}, Success Rate: {</w:t>
+      </w:r>
       <w:proofErr w:type="spellStart"/>
       <w:r>
         <w:rPr>
@@ -13744,113 +13386,20 @@
         <w:rPr>
           <w:rFonts w:hint="eastAsia"/>
         </w:rPr>
-        <w:t xml:space="preserve"> = </w:t>
-      </w:r>
-      <w:proofErr w:type="spellStart"/>
-      <w:r>
-        <w:rPr>
-          <w:rFonts w:hint="eastAsia"/>
-        </w:rPr>
-        <w:t>success_count</w:t>
-      </w:r>
-      <w:proofErr w:type="spellEnd"/>
-      <w:r>
-        <w:rPr>
-          <w:rFonts w:hint="eastAsia"/>
-        </w:rPr>
-        <w:t xml:space="preserve"> / </w:t>
+        <w:t xml:space="preserve"> * 100:.2</w:t>
       </w:r>
       <w:proofErr w:type="gramStart"/>
       <w:r>
         <w:rPr>
           <w:rFonts w:hint="eastAsia"/>
         </w:rPr>
-        <w:t>10.0  #</w:t>
+        <w:t>f}%</w:t>
       </w:r>
       <w:proofErr w:type="gramEnd"/>
       <w:r>
         <w:rPr>
           <w:rFonts w:hint="eastAsia"/>
         </w:rPr>
-        <w:t xml:space="preserve"> </w:t>
-      </w:r>
-      <w:proofErr w:type="spellStart"/>
-      <w:r>
-        <w:rPr>
-          <w:rFonts w:ascii="宋体" w:eastAsia="宋体" w:hAnsi="宋体" w:cs="宋体" w:hint="eastAsia"/>
-        </w:rPr>
-        <w:t>成功率</w:t>
-      </w:r>
-      <w:proofErr w:type="spellEnd"/>
-    </w:p>
-    <w:p>
-      <w:pPr>
-        <w:pStyle w:val="-"/>
-        <w:ind w:firstLine="360"/>
-        <w:rPr>
-          <w:rFonts w:ascii="宋体" w:eastAsia="宋体" w:hAnsi="宋体" w:cs="宋体" w:hint="eastAsia"/>
-          <w:lang w:eastAsia="zh-CN"/>
-        </w:rPr>
-      </w:pPr>
-    </w:p>
-    <w:p>
-      <w:pPr>
-        <w:pStyle w:val="-"/>
-      </w:pPr>
-      <w:r>
-        <w:rPr>
-          <w:rFonts w:hint="eastAsia"/>
-        </w:rPr>
-        <w:t xml:space="preserve">    </w:t>
-      </w:r>
-      <w:proofErr w:type="gramStart"/>
-      <w:r>
-        <w:rPr>
-          <w:rFonts w:hint="eastAsia"/>
-        </w:rPr>
-        <w:t>print(</w:t>
-      </w:r>
-      <w:proofErr w:type="spellStart"/>
-      <w:proofErr w:type="gramEnd"/>
-      <w:r>
-        <w:rPr>
-          <w:rFonts w:hint="eastAsia"/>
-        </w:rPr>
-        <w:t>f"Test</w:t>
-      </w:r>
-      <w:proofErr w:type="spellEnd"/>
-      <w:r>
-        <w:rPr>
-          <w:rFonts w:hint="eastAsia"/>
-        </w:rPr>
-        <w:t xml:space="preserve"> Results - Avg Reward: {avg_reward:.2f}, Success Rate: {</w:t>
-      </w:r>
-      <w:proofErr w:type="spellStart"/>
-      <w:r>
-        <w:rPr>
-          <w:rFonts w:hint="eastAsia"/>
-        </w:rPr>
-        <w:t>success_rate</w:t>
-      </w:r>
-      <w:proofErr w:type="spellEnd"/>
-      <w:r>
-        <w:rPr>
-          <w:rFonts w:hint="eastAsia"/>
-        </w:rPr>
-        <w:t xml:space="preserve"> * 100:.2</w:t>
-      </w:r>
-      <w:proofErr w:type="gramStart"/>
-      <w:r>
-        <w:rPr>
-          <w:rFonts w:hint="eastAsia"/>
-        </w:rPr>
-        <w:t>f}%</w:t>
-      </w:r>
-      <w:proofErr w:type="gramEnd"/>
-      <w:r>
-        <w:rPr>
-          <w:rFonts w:hint="eastAsia"/>
-        </w:rPr>
         <w:t>")</w:t>
       </w:r>
     </w:p>
@@ -13859,7 +13408,7 @@
         <w:pStyle w:val="-"/>
         <w:ind w:firstLine="300"/>
         <w:rPr>
-          <w:rFonts w:eastAsiaTheme="minorEastAsia" w:hint="eastAsia"/>
+          <w:rFonts w:eastAsiaTheme="minorEastAsia"/>
           <w:lang w:eastAsia="zh-CN"/>
         </w:rPr>
       </w:pPr>
@@ -13890,18 +13439,26 @@
         </w:tabs>
         <w:spacing w:before="0" w:after="0" w:line="415" w:lineRule="auto"/>
         <w:rPr>
+          <w:rFonts w:eastAsia="宋体"/>
+          <w:sz w:val="24"/>
+          <w:szCs w:val="24"/>
+        </w:rPr>
+      </w:pPr>
+      <w:r>
+        <w:rPr>
           <w:rFonts w:eastAsia="宋体" w:hint="eastAsia"/>
           <w:sz w:val="24"/>
           <w:szCs w:val="24"/>
         </w:rPr>
-      </w:pPr>
+        <w:t xml:space="preserve">8.4.5 </w:t>
+      </w:r>
       <w:r>
         <w:rPr>
           <w:rFonts w:eastAsia="宋体" w:hint="eastAsia"/>
           <w:sz w:val="24"/>
           <w:szCs w:val="24"/>
         </w:rPr>
-        <w:t xml:space="preserve">8.4.5 </w:t>
+        <w:t>性能评估</w:t>
       </w:r>
       <w:r>
         <w:rPr>
@@ -13909,14 +13466,6 @@
           <w:sz w:val="24"/>
           <w:szCs w:val="24"/>
         </w:rPr>
-        <w:t>性能评估</w:t>
-      </w:r>
-      <w:r>
-        <w:rPr>
-          <w:rFonts w:eastAsia="宋体" w:hint="eastAsia"/>
-          <w:sz w:val="24"/>
-          <w:szCs w:val="24"/>
-        </w:rPr>
         <w:tab/>
       </w:r>
     </w:p>
@@ -14028,13 +13577,20 @@
     <w:p>
       <w:pPr>
         <w:pStyle w:val="-"/>
-      </w:pPr>
-      <w:r>
+        <w:rPr>
+          <w:lang w:eastAsia="zh-CN"/>
+        </w:rPr>
+      </w:pPr>
+      <w:r>
+        <w:rPr>
+          <w:lang w:eastAsia="zh-CN"/>
+        </w:rPr>
         <w:t xml:space="preserve"># </w:t>
       </w:r>
       <w:r>
         <w:rPr>
           <w:rFonts w:eastAsia="宋体" w:hint="eastAsia"/>
+          <w:lang w:eastAsia="zh-CN"/>
         </w:rPr>
         <w:t>绘制学习曲线</w:t>
       </w:r>
@@ -14042,95 +13598,68 @@
     <w:p>
       <w:pPr>
         <w:pStyle w:val="-"/>
-      </w:pPr>
-      <w:r>
-        <w:t xml:space="preserve">def </w:t>
-      </w:r>
-      <w:proofErr w:type="spellStart"/>
-      <w:r>
-        <w:t>plot_learning_curve</w:t>
-      </w:r>
-      <w:proofErr w:type="spellEnd"/>
-      <w:r>
-        <w:t>(</w:t>
-      </w:r>
-      <w:proofErr w:type="spellStart"/>
-      <w:r>
-        <w:t>episode_rewards</w:t>
-      </w:r>
-      <w:proofErr w:type="spellEnd"/>
-      <w:r>
-        <w:t>):</w:t>
-      </w:r>
-    </w:p>
-    <w:p>
-      <w:pPr>
-        <w:pStyle w:val="-"/>
-      </w:pPr>
-      <w:r>
-        <w:t xml:space="preserve">    </w:t>
-      </w:r>
-      <w:proofErr w:type="spellStart"/>
-      <w:proofErr w:type="gramStart"/>
-      <w:r>
-        <w:t>plt.plot</w:t>
-      </w:r>
-      <w:proofErr w:type="spellEnd"/>
-      <w:proofErr w:type="gramEnd"/>
-      <w:r>
-        <w:t>(</w:t>
-      </w:r>
-      <w:proofErr w:type="spellStart"/>
-      <w:r>
-        <w:t>episode_rewards</w:t>
-      </w:r>
-      <w:proofErr w:type="spellEnd"/>
-      <w:r>
-        <w:t>)</w:t>
-      </w:r>
-    </w:p>
-    <w:p>
-      <w:pPr>
-        <w:pStyle w:val="-"/>
-      </w:pPr>
-      <w:r>
+        <w:rPr>
+          <w:lang w:eastAsia="zh-CN"/>
+        </w:rPr>
+      </w:pPr>
+      <w:r>
+        <w:rPr>
+          <w:lang w:eastAsia="zh-CN"/>
+        </w:rPr>
+        <w:t>def plot_learning_curve(episode_rewards):</w:t>
+      </w:r>
+    </w:p>
+    <w:p>
+      <w:pPr>
+        <w:pStyle w:val="-"/>
+        <w:rPr>
+          <w:lang w:eastAsia="zh-CN"/>
+        </w:rPr>
+      </w:pPr>
+      <w:r>
+        <w:rPr>
+          <w:lang w:eastAsia="zh-CN"/>
+        </w:rPr>
+        <w:t xml:space="preserve">    plt.plot(episode_rewards)</w:t>
+      </w:r>
+    </w:p>
+    <w:p>
+      <w:pPr>
+        <w:pStyle w:val="-"/>
+        <w:rPr>
+          <w:lang w:eastAsia="zh-CN"/>
+        </w:rPr>
+      </w:pPr>
+      <w:r>
+        <w:rPr>
+          <w:lang w:eastAsia="zh-CN"/>
+        </w:rPr>
         <w:lastRenderedPageBreak/>
-        <w:t xml:space="preserve">    </w:t>
-      </w:r>
-      <w:proofErr w:type="spellStart"/>
-      <w:proofErr w:type="gramStart"/>
-      <w:r>
-        <w:t>plt.xlabel</w:t>
-      </w:r>
-      <w:proofErr w:type="spellEnd"/>
-      <w:proofErr w:type="gramEnd"/>
-      <w:r>
-        <w:t>('Episodes')</w:t>
-      </w:r>
-    </w:p>
-    <w:p>
-      <w:pPr>
-        <w:pStyle w:val="-"/>
-      </w:pPr>
-      <w:r>
-        <w:t xml:space="preserve">    </w:t>
-      </w:r>
-      <w:proofErr w:type="spellStart"/>
-      <w:proofErr w:type="gramStart"/>
-      <w:r>
-        <w:t>plt.ylabel</w:t>
-      </w:r>
-      <w:proofErr w:type="spellEnd"/>
-      <w:proofErr w:type="gramEnd"/>
-      <w:r>
-        <w:t>('Reward')</w:t>
-      </w:r>
-    </w:p>
-    <w:p>
-      <w:pPr>
-        <w:pStyle w:val="-"/>
-      </w:pPr>
-      <w:r>
+        <w:t xml:space="preserve">    plt.xlabel('Episodes')</w:t>
+      </w:r>
+    </w:p>
+    <w:p>
+      <w:pPr>
+        <w:pStyle w:val="-"/>
+        <w:rPr>
+          <w:lang w:eastAsia="zh-CN"/>
+        </w:rPr>
+      </w:pPr>
+      <w:r>
+        <w:rPr>
+          <w:lang w:eastAsia="zh-CN"/>
+        </w:rPr>
+        <w:t xml:space="preserve">    plt.ylabel('Reward')</w:t>
+      </w:r>
+    </w:p>
+    <w:p>
+      <w:pPr>
+        <w:pStyle w:val="-"/>
+      </w:pPr>
+      <w:r>
+        <w:rPr>
+          <w:lang w:eastAsia="zh-CN"/>
+        </w:rPr>
         <w:t xml:space="preserve">    </w:t>
       </w:r>
       <w:proofErr w:type="spellStart"/>
@@ -14170,7 +13699,7 @@
         <w:ind w:firstLineChars="0" w:firstLine="0"/>
         <w:jc w:val="center"/>
         <w:rPr>
-          <w:rFonts w:eastAsiaTheme="minorEastAsia" w:hint="eastAsia"/>
+          <w:rFonts w:eastAsiaTheme="minorEastAsia"/>
         </w:rPr>
       </w:pPr>
       <w:r>
@@ -14219,9 +13748,6 @@
     <w:p>
       <w:pPr>
         <w:pStyle w:val="-7"/>
-        <w:rPr>
-          <w:rFonts w:hint="eastAsia"/>
-        </w:rPr>
       </w:pPr>
       <w:r>
         <w:rPr>
@@ -14428,164 +13954,126 @@
     <w:p>
       <w:pPr>
         <w:pStyle w:val="-"/>
-      </w:pPr>
-      <w:proofErr w:type="spellStart"/>
-      <w:r>
-        <w:t>avg_reward</w:t>
-      </w:r>
-      <w:proofErr w:type="spellEnd"/>
-      <w:r>
-        <w:t xml:space="preserve"> = </w:t>
-      </w:r>
-      <w:proofErr w:type="spellStart"/>
+        <w:rPr>
+          <w:lang w:eastAsia="zh-CN"/>
+        </w:rPr>
+      </w:pPr>
+      <w:r>
+        <w:rPr>
+          <w:lang w:eastAsia="zh-CN"/>
+        </w:rPr>
+        <w:t xml:space="preserve">avg_reward = np.mean(total_rewards)  # </w:t>
+      </w:r>
+      <w:r>
+        <w:rPr>
+          <w:rFonts w:eastAsia="宋体" w:hint="eastAsia"/>
+          <w:lang w:eastAsia="zh-CN"/>
+        </w:rPr>
+        <w:t>计算奖励的平均值</w:t>
+      </w:r>
+    </w:p>
+    <w:p>
+      <w:pPr>
+        <w:pStyle w:val="-"/>
+        <w:rPr>
+          <w:rFonts w:eastAsia="宋体"/>
+          <w:lang w:eastAsia="zh-CN"/>
+        </w:rPr>
+      </w:pPr>
+      <w:r>
+        <w:rPr>
+          <w:lang w:eastAsia="zh-CN"/>
+        </w:rPr>
+        <w:t xml:space="preserve">success_rate = success_count / </w:t>
+      </w:r>
+      <w:r>
+        <w:rPr>
+          <w:rFonts w:eastAsia="宋体"/>
+          <w:lang w:eastAsia="zh-CN"/>
+        </w:rPr>
+        <w:t>10.0</w:t>
+      </w:r>
+      <w:r>
+        <w:rPr>
+          <w:lang w:eastAsia="zh-CN"/>
+        </w:rPr>
+        <w:t xml:space="preserve">  # </w:t>
+      </w:r>
+      <w:r>
+        <w:rPr>
+          <w:rFonts w:eastAsia="宋体" w:hint="eastAsia"/>
+          <w:lang w:eastAsia="zh-CN"/>
+        </w:rPr>
+        <w:t>计算成功率</w:t>
+      </w:r>
+    </w:p>
+    <w:p>
+      <w:pPr>
+        <w:pStyle w:val="-"/>
+        <w:rPr>
+          <w:rFonts w:eastAsiaTheme="minorEastAsia"/>
+          <w:lang w:eastAsia="zh-CN"/>
+        </w:rPr>
+      </w:pPr>
       <w:proofErr w:type="gramStart"/>
       <w:r>
-        <w:t>np.mean</w:t>
-      </w:r>
-      <w:proofErr w:type="spellEnd"/>
+        <w:t>print(</w:t>
+      </w:r>
+      <w:proofErr w:type="spellStart"/>
       <w:proofErr w:type="gramEnd"/>
       <w:r>
-        <w:t>(</w:t>
-      </w:r>
-      <w:proofErr w:type="spellStart"/>
-      <w:r>
-        <w:t>total_</w:t>
+        <w:t>f"Test</w:t>
+      </w:r>
+      <w:proofErr w:type="spellEnd"/>
+      <w:r>
+        <w:t xml:space="preserve"> Results - Avg Reward: {avg_reward:</w:t>
+      </w:r>
+      <w:r>
+        <w:rPr>
+          <w:rFonts w:eastAsia="宋体"/>
+        </w:rPr>
+        <w:t>.2</w:t>
+      </w:r>
+      <w:r>
+        <w:t>f}, Success Rate: {</w:t>
+      </w:r>
+      <w:proofErr w:type="spellStart"/>
+      <w:r>
+        <w:t>success_rate</w:t>
+      </w:r>
+      <w:proofErr w:type="spellEnd"/>
+      <w:r>
+        <w:t xml:space="preserve"> * </w:t>
+      </w:r>
+      <w:r>
+        <w:rPr>
+          <w:rFonts w:eastAsia="宋体"/>
+        </w:rPr>
+        <w:t>100</w:t>
+      </w:r>
+      <w:r>
+        <w:t>:</w:t>
+      </w:r>
+      <w:r>
+        <w:rPr>
+          <w:rFonts w:eastAsia="宋体"/>
+        </w:rPr>
+        <w:t>.2</w:t>
       </w:r>
       <w:proofErr w:type="gramStart"/>
       <w:r>
-        <w:t>rewards</w:t>
-      </w:r>
-      <w:proofErr w:type="spellEnd"/>
-      <w:r>
-        <w:t>)  #</w:t>
+        <w:t>f}%</w:t>
       </w:r>
       <w:proofErr w:type="gramEnd"/>
       <w:r>
-        <w:t xml:space="preserve"> </w:t>
-      </w:r>
-      <w:proofErr w:type="spellStart"/>
-      <w:r>
-        <w:rPr>
-          <w:rFonts w:eastAsia="宋体" w:hint="eastAsia"/>
-        </w:rPr>
-        <w:t>计算奖励的平均值</w:t>
-      </w:r>
-      <w:proofErr w:type="spellEnd"/>
-    </w:p>
-    <w:p>
-      <w:pPr>
-        <w:pStyle w:val="-"/>
-        <w:rPr>
-          <w:rFonts w:eastAsia="宋体"/>
-          <w:lang w:eastAsia="zh-CN"/>
-        </w:rPr>
-      </w:pPr>
-      <w:proofErr w:type="spellStart"/>
-      <w:r>
-        <w:t>success_rate</w:t>
-      </w:r>
-      <w:proofErr w:type="spellEnd"/>
-      <w:r>
-        <w:t xml:space="preserve"> = </w:t>
-      </w:r>
-      <w:proofErr w:type="spellStart"/>
-      <w:r>
-        <w:t>success_count</w:t>
-      </w:r>
-      <w:proofErr w:type="spellEnd"/>
-      <w:r>
-        <w:t xml:space="preserve"> / </w:t>
-      </w:r>
-      <w:proofErr w:type="gramStart"/>
-      <w:r>
-        <w:rPr>
-          <w:rFonts w:eastAsia="宋体"/>
-        </w:rPr>
-        <w:t>10.0</w:t>
-      </w:r>
-      <w:r>
-        <w:t xml:space="preserve">  #</w:t>
-      </w:r>
-      <w:proofErr w:type="gramEnd"/>
-      <w:r>
-        <w:t xml:space="preserve"> </w:t>
-      </w:r>
-      <w:proofErr w:type="spellStart"/>
-      <w:r>
-        <w:rPr>
-          <w:rFonts w:eastAsia="宋体" w:hint="eastAsia"/>
-        </w:rPr>
-        <w:t>计算成功率</w:t>
-      </w:r>
-      <w:proofErr w:type="spellEnd"/>
-    </w:p>
-    <w:p>
-      <w:pPr>
-        <w:pStyle w:val="-"/>
+        <w:t>")</w:t>
+      </w:r>
+    </w:p>
+    <w:p>
+      <w:pPr>
+        <w:pStyle w:val="-5"/>
         <w:rPr>
           <w:rFonts w:eastAsiaTheme="minorEastAsia"/>
-          <w:lang w:eastAsia="zh-CN"/>
-        </w:rPr>
-      </w:pPr>
-      <w:proofErr w:type="gramStart"/>
-      <w:r>
-        <w:t>print(</w:t>
-      </w:r>
-      <w:proofErr w:type="spellStart"/>
-      <w:proofErr w:type="gramEnd"/>
-      <w:r>
-        <w:t>f"Test</w:t>
-      </w:r>
-      <w:proofErr w:type="spellEnd"/>
-      <w:r>
-        <w:t xml:space="preserve"> Results - Avg Reward: {avg_reward:</w:t>
-      </w:r>
-      <w:r>
-        <w:rPr>
-          <w:rFonts w:eastAsia="宋体"/>
-        </w:rPr>
-        <w:t>.2</w:t>
-      </w:r>
-      <w:r>
-        <w:t>f}, Success Rate: {</w:t>
-      </w:r>
-      <w:proofErr w:type="spellStart"/>
-      <w:r>
-        <w:t>success_rate</w:t>
-      </w:r>
-      <w:proofErr w:type="spellEnd"/>
-      <w:r>
-        <w:t xml:space="preserve"> * </w:t>
-      </w:r>
-      <w:r>
-        <w:rPr>
-          <w:rFonts w:eastAsia="宋体"/>
-        </w:rPr>
-        <w:t>100</w:t>
-      </w:r>
-      <w:r>
-        <w:t>:</w:t>
-      </w:r>
-      <w:r>
-        <w:rPr>
-          <w:rFonts w:eastAsia="宋体"/>
-        </w:rPr>
-        <w:t>.2</w:t>
-      </w:r>
-      <w:proofErr w:type="gramStart"/>
-      <w:r>
-        <w:t>f}%</w:t>
-      </w:r>
-      <w:proofErr w:type="gramEnd"/>
-      <w:r>
-        <w:t>")</w:t>
-      </w:r>
-    </w:p>
-    <w:p>
-      <w:pPr>
-        <w:pStyle w:val="-5"/>
-        <w:rPr>
-          <w:rFonts w:eastAsiaTheme="minorEastAsia" w:hint="eastAsia"/>
           <w:b/>
           <w:bCs/>
         </w:rPr>
@@ -14634,9 +14122,6 @@
     <w:p>
       <w:pPr>
         <w:pStyle w:val="-7"/>
-        <w:rPr>
-          <w:rFonts w:hint="eastAsia"/>
-        </w:rPr>
       </w:pPr>
       <w:r>
         <w:rPr>
@@ -14741,7 +14226,7 @@
           <w:sz w:val="24"/>
           <w:szCs w:val="24"/>
         </w:rPr>
-        <w:t>8.4.</w:t>
+        <w:t xml:space="preserve">8.4.6 </w:t>
       </w:r>
       <w:r>
         <w:rPr>
@@ -14749,29 +14234,13 @@
           <w:sz w:val="24"/>
           <w:szCs w:val="24"/>
         </w:rPr>
-        <w:t>6</w:t>
-      </w:r>
-      <w:r>
-        <w:rPr>
-          <w:rFonts w:eastAsia="宋体" w:hint="eastAsia"/>
-          <w:sz w:val="24"/>
-          <w:szCs w:val="24"/>
-        </w:rPr>
-        <w:t xml:space="preserve"> </w:t>
-      </w:r>
-      <w:r>
-        <w:rPr>
-          <w:rFonts w:eastAsia="宋体" w:hint="eastAsia"/>
-          <w:sz w:val="24"/>
-          <w:szCs w:val="24"/>
-        </w:rPr>
         <w:t>主函数</w:t>
       </w:r>
     </w:p>
     <w:p>
       <w:pPr>
         <w:rPr>
-          <w:rFonts w:ascii="宋体" w:eastAsia="宋体" w:hAnsi="宋体" w:hint="eastAsia"/>
+          <w:rFonts w:ascii="宋体" w:eastAsia="宋体" w:hAnsi="宋体"/>
         </w:rPr>
       </w:pPr>
       <w:r>
@@ -14850,6 +14319,7 @@
       <w:r>
         <w:t xml:space="preserve">")  # </w:t>
       </w:r>
+      <w:proofErr w:type="spellStart"/>
       <w:r>
         <w:rPr>
           <w:rFonts w:ascii="宋体" w:eastAsia="宋体" w:hAnsi="宋体" w:cs="宋体" w:hint="eastAsia"/>
@@ -14859,6 +14329,7 @@
       <w:r>
         <w:t>GPU</w:t>
       </w:r>
+      <w:proofErr w:type="spellEnd"/>
       <w:r>
         <w:br/>
       </w:r>
@@ -14866,11 +14337,19 @@
         <w:br/>
         <w:t xml:space="preserve">    # </w:t>
       </w:r>
+      <w:proofErr w:type="spellStart"/>
       <w:r>
         <w:rPr>
           <w:rFonts w:ascii="宋体" w:eastAsia="宋体" w:hAnsi="宋体" w:cs="宋体" w:hint="eastAsia"/>
         </w:rPr>
-        <w:t>第一次代理环境运行（可以选择注释掉）</w:t>
+        <w:t>第一次代理环境运行（可以选择注释掉</w:t>
+      </w:r>
+      <w:proofErr w:type="spellEnd"/>
+      <w:r>
+        <w:rPr>
+          <w:rFonts w:ascii="宋体" w:eastAsia="宋体" w:hAnsi="宋体" w:cs="宋体" w:hint="eastAsia"/>
+        </w:rPr>
+        <w:t>）</w:t>
       </w:r>
       <w:r>
         <w:rPr>
@@ -14894,6 +14373,7 @@
         <w:br/>
         <w:t xml:space="preserve">    # </w:t>
       </w:r>
+      <w:proofErr w:type="spellStart"/>
       <w:r>
         <w:rPr>
           <w:rFonts w:ascii="宋体" w:eastAsia="宋体" w:hAnsi="宋体" w:cs="宋体" w:hint="eastAsia"/>
@@ -14903,6 +14383,7 @@
       <w:r>
         <w:t>DQN</w:t>
       </w:r>
+      <w:proofErr w:type="spellEnd"/>
       <w:r>
         <w:br/>
         <w:t xml:space="preserve">    </w:t>
@@ -14922,12 +14403,14 @@
         <w:br/>
         <w:t xml:space="preserve">    # </w:t>
       </w:r>
+      <w:proofErr w:type="spellStart"/>
       <w:r>
         <w:rPr>
           <w:rFonts w:ascii="宋体" w:eastAsia="宋体" w:hAnsi="宋体" w:cs="宋体" w:hint="eastAsia"/>
         </w:rPr>
         <w:t>加载训练好的策略网络并进行测试</w:t>
       </w:r>
+      <w:proofErr w:type="spellEnd"/>
       <w:r>
         <w:rPr>
           <w:rFonts w:hint="eastAsia"/>
@@ -14979,12 +14462,14 @@
       <w:r>
         <w:t xml:space="preserve">=True))  # </w:t>
       </w:r>
+      <w:proofErr w:type="spellStart"/>
       <w:r>
         <w:rPr>
           <w:rFonts w:ascii="宋体" w:eastAsia="宋体" w:hAnsi="宋体" w:cs="宋体" w:hint="eastAsia"/>
         </w:rPr>
         <w:t>加载训练好的模型权重</w:t>
       </w:r>
+      <w:proofErr w:type="spellEnd"/>
       <w:r>
         <w:rPr>
           <w:rFonts w:hint="eastAsia"/>
@@ -15000,12 +14485,14 @@
       <w:r>
         <w:t xml:space="preserve">()  # </w:t>
       </w:r>
+      <w:proofErr w:type="spellStart"/>
       <w:r>
         <w:rPr>
           <w:rFonts w:ascii="宋体" w:eastAsia="宋体" w:hAnsi="宋体" w:cs="宋体" w:hint="eastAsia"/>
         </w:rPr>
         <w:t>设置为评估模式</w:t>
       </w:r>
+      <w:proofErr w:type="spellEnd"/>
       <w:r>
         <w:rPr>
           <w:rFonts w:hint="eastAsia"/>
@@ -15022,12 +14509,14 @@
       <w:r>
         <w:t xml:space="preserve"># </w:t>
       </w:r>
+      <w:proofErr w:type="spellStart"/>
       <w:r>
         <w:rPr>
           <w:rFonts w:ascii="宋体" w:eastAsia="宋体" w:hAnsi="宋体" w:cs="宋体" w:hint="eastAsia"/>
         </w:rPr>
         <w:t>测试训练好的模型</w:t>
       </w:r>
+      <w:proofErr w:type="spellEnd"/>
       <w:r>
         <w:rPr>
           <w:rFonts w:hint="eastAsia"/>
@@ -15049,16 +14538,13 @@
         <w:pStyle w:val="-5"/>
         <w:ind w:firstLineChars="0" w:firstLine="0"/>
         <w:rPr>
-          <w:rFonts w:ascii="Times New Roman" w:hAnsi="Times New Roman" w:cs="Courier New" w:hint="eastAsia"/>
+          <w:rFonts w:ascii="Times New Roman" w:hAnsi="Times New Roman" w:cs="Courier New"/>
         </w:rPr>
       </w:pPr>
     </w:p>
     <w:p>
       <w:pPr>
         <w:pStyle w:val="-2"/>
-        <w:rPr>
-          <w:rFonts w:hint="eastAsia"/>
-        </w:rPr>
       </w:pPr>
       <w:r>
         <w:rPr>
@@ -15077,9 +14563,6 @@
       <w:pPr>
         <w:pStyle w:val="-5"/>
         <w:ind w:firstLineChars="0"/>
-        <w:rPr>
-          <w:rFonts w:hint="eastAsia"/>
-        </w:rPr>
       </w:pPr>
       <w:r>
         <w:rPr>
@@ -15167,9 +14650,6 @@
     <w:p>
       <w:pPr>
         <w:pStyle w:val="-5"/>
-        <w:rPr>
-          <w:rFonts w:hint="eastAsia"/>
-        </w:rPr>
       </w:pPr>
       <w:r>
         <w:rPr>
@@ -15225,9 +14705,6 @@
     <w:p>
       <w:pPr>
         <w:pStyle w:val="-5"/>
-        <w:rPr>
-          <w:rFonts w:hint="eastAsia"/>
-        </w:rPr>
       </w:pPr>
       <w:r>
         <w:t>总的来说，本实验通过应用</w:t>
@@ -15258,9 +14735,6 @@
     <w:p>
       <w:pPr>
         <w:pStyle w:val="-2"/>
-        <w:rPr>
-          <w:rFonts w:hint="eastAsia"/>
-        </w:rPr>
       </w:pPr>
       <w:r>
         <w:rPr>
@@ -15278,9 +14752,6 @@
     <w:p>
       <w:pPr>
         <w:pStyle w:val="-5"/>
-        <w:rPr>
-          <w:rFonts w:hint="eastAsia"/>
-        </w:rPr>
       </w:pPr>
       <w:r>
         <w:rPr>
@@ -15292,9 +14763,6 @@
     <w:p>
       <w:pPr>
         <w:pStyle w:val="-5"/>
-        <w:rPr>
-          <w:rFonts w:hint="eastAsia"/>
-        </w:rPr>
       </w:pPr>
       <w:r>
         <w:rPr>
@@ -15306,9 +14774,6 @@
     <w:p>
       <w:pPr>
         <w:pStyle w:val="-5"/>
-        <w:rPr>
-          <w:rFonts w:hint="eastAsia"/>
-        </w:rPr>
       </w:pPr>
       <w:r>
         <w:rPr>
@@ -15320,9 +14785,6 @@
     <w:p>
       <w:pPr>
         <w:pStyle w:val="-5"/>
-        <w:rPr>
-          <w:rFonts w:hint="eastAsia"/>
-        </w:rPr>
       </w:pPr>
       <w:r>
         <w:rPr>
@@ -15334,9 +14796,6 @@
     <w:p>
       <w:pPr>
         <w:pStyle w:val="-2"/>
-        <w:rPr>
-          <w:rFonts w:hint="eastAsia"/>
-        </w:rPr>
       </w:pPr>
       <w:r>
         <w:rPr>
@@ -17449,6 +16908,7 @@
   <w:style w:type="character" w:default="1" w:styleId="a0">
     <w:name w:val="Default Paragraph Font"/>
     <w:uiPriority w:val="1"/>
+    <w:semiHidden/>
     <w:unhideWhenUsed/>
   </w:style>
   <w:style w:type="table" w:default="1" w:styleId="a1">

</xml_diff>